<commit_message>
Ajusta STATIC_ROOT para /srv/minhacnhonline/staticfiles e corrige STATICFILES_DIRS
</commit_message>
<xml_diff>
--- a/Documentos_Ajuda/Preparar servidor de banco de dados.docx
+++ b/Documentos_Ajuda/Preparar servidor de banco de dados.docx
@@ -11546,37 +11546,7 @@
           <w:iCs/>
           <w:color w:val="C00000"/>
         </w:rPr>
-        <w:t>1</w:t>
-      </w:r>
-      <w:r>
-        <w:rPr>
-          <w:b/>
-          <w:bCs/>
-          <w:i/>
-          <w:iCs/>
-          <w:color w:val="C00000"/>
-        </w:rPr>
-        <w:t>1</w:t>
-      </w:r>
-      <w:r>
-        <w:rPr>
-          <w:b/>
-          <w:bCs/>
-          <w:i/>
-          <w:iCs/>
-          <w:color w:val="C00000"/>
-        </w:rPr>
-        <w:t xml:space="preserve">. </w:t>
-      </w:r>
-      <w:r>
-        <w:rPr>
-          <w:b/>
-          <w:bCs/>
-          <w:i/>
-          <w:iCs/>
-          <w:color w:val="C00000"/>
-        </w:rPr>
-        <w:t xml:space="preserve">Identificamos um problema: </w:t>
+        <w:t xml:space="preserve">11. Identificamos um problema: </w:t>
       </w:r>
       <w:r>
         <w:rPr>
@@ -11941,10 +11911,7 @@
         </w:numPr>
       </w:pPr>
       <w:r>
-        <w:t>Confirme se a home do usuário “multimidia” agora aponta para “</w:t>
-      </w:r>
-      <w:r>
-        <w:t>/</w:t>
+        <w:t>Confirme se a home do usuário “multimidia” agora aponta para “/</w:t>
       </w:r>
       <w:proofErr w:type="spellStart"/>
       <w:r>
@@ -15159,7 +15126,7 @@
           <w:iCs/>
           <w:color w:val="C00000"/>
         </w:rPr>
-        <w:t>1</w:t>
+        <w:t xml:space="preserve">13. </w:t>
       </w:r>
       <w:r>
         <w:rPr>
@@ -15169,8 +15136,9 @@
           <w:iCs/>
           <w:color w:val="C00000"/>
         </w:rPr>
-        <w:t>3</w:t>
-      </w:r>
+        <w:t xml:space="preserve">Permitir que o </w:t>
+      </w:r>
+      <w:proofErr w:type="spellStart"/>
       <w:r>
         <w:rPr>
           <w:b/>
@@ -15179,8 +15147,9 @@
           <w:iCs/>
           <w:color w:val="C00000"/>
         </w:rPr>
-        <w:t xml:space="preserve">. </w:t>
-      </w:r>
+        <w:t>hook</w:t>
+      </w:r>
+      <w:proofErr w:type="spellEnd"/>
       <w:r>
         <w:rPr>
           <w:b/>
@@ -15189,522 +15158,467 @@
           <w:iCs/>
           <w:color w:val="C00000"/>
         </w:rPr>
-        <w:t xml:space="preserve">Permitir que o </w:t>
-      </w:r>
-      <w:proofErr w:type="spellStart"/>
-      <w:r>
-        <w:rPr>
-          <w:b/>
-          <w:bCs/>
-          <w:i/>
-          <w:iCs/>
+        <w:t xml:space="preserve"> reinicie o serviço sem senha</w:t>
+      </w:r>
+    </w:p>
+    <w:p>
+      <w:pPr>
+        <w:rPr>
           <w:color w:val="C00000"/>
         </w:rPr>
-        <w:t>hook</w:t>
-      </w:r>
-      <w:proofErr w:type="spellEnd"/>
-      <w:r>
-        <w:rPr>
-          <w:b/>
-          <w:bCs/>
-          <w:i/>
-          <w:iCs/>
+      </w:pPr>
+      <w:r>
+        <w:rPr>
           <w:color w:val="C00000"/>
         </w:rPr>
-        <w:t xml:space="preserve"> reinicie o serviço sem senha</w:t>
-      </w:r>
-    </w:p>
-    <w:p>
-      <w:pPr>
+        <w:t>Cria um arquivo de configuração chamado </w:t>
+      </w:r>
+      <w:proofErr w:type="spellStart"/>
+      <w:r>
         <w:rPr>
           <w:color w:val="C00000"/>
         </w:rPr>
-      </w:pPr>
+        <w:t>minhacnhonline</w:t>
+      </w:r>
+      <w:proofErr w:type="spellEnd"/>
       <w:r>
         <w:rPr>
           <w:color w:val="C00000"/>
         </w:rPr>
-        <w:t>C</w:t>
-      </w:r>
+        <w:t> dentro de /</w:t>
+      </w:r>
+      <w:proofErr w:type="spellStart"/>
       <w:r>
         <w:rPr>
           <w:color w:val="C00000"/>
         </w:rPr>
-        <w:t>ria um arquivo de configuração chamado </w:t>
-      </w:r>
-      <w:proofErr w:type="spellStart"/>
+        <w:t>etc</w:t>
+      </w:r>
+      <w:proofErr w:type="spellEnd"/>
       <w:r>
         <w:rPr>
           <w:color w:val="C00000"/>
         </w:rPr>
+        <w:t>/</w:t>
+      </w:r>
+      <w:proofErr w:type="spellStart"/>
+      <w:proofErr w:type="gramStart"/>
+      <w:r>
+        <w:rPr>
+          <w:color w:val="C00000"/>
+        </w:rPr>
+        <w:t>sudoers.d</w:t>
+      </w:r>
+      <w:proofErr w:type="spellEnd"/>
+      <w:proofErr w:type="gramEnd"/>
+      <w:r>
+        <w:rPr>
+          <w:color w:val="C00000"/>
+        </w:rPr>
+        <w:t>/ e insere uma regra que permite ao usuário multimidia executar o comando </w:t>
+      </w:r>
+      <w:proofErr w:type="spellStart"/>
+      <w:r>
+        <w:rPr>
+          <w:color w:val="C00000"/>
+        </w:rPr>
+        <w:t>sudo</w:t>
+      </w:r>
+      <w:proofErr w:type="spellEnd"/>
+      <w:r>
+        <w:rPr>
+          <w:color w:val="C00000"/>
+        </w:rPr>
+        <w:t xml:space="preserve"> </w:t>
+      </w:r>
+      <w:proofErr w:type="spellStart"/>
+      <w:r>
+        <w:rPr>
+          <w:color w:val="C00000"/>
+        </w:rPr>
+        <w:t>systemctl</w:t>
+      </w:r>
+      <w:proofErr w:type="spellEnd"/>
+      <w:r>
+        <w:rPr>
+          <w:color w:val="C00000"/>
+        </w:rPr>
+        <w:t xml:space="preserve"> </w:t>
+      </w:r>
+      <w:proofErr w:type="spellStart"/>
+      <w:r>
+        <w:rPr>
+          <w:color w:val="C00000"/>
+        </w:rPr>
+        <w:t>restart</w:t>
+      </w:r>
+      <w:proofErr w:type="spellEnd"/>
+      <w:r>
+        <w:rPr>
+          <w:color w:val="C00000"/>
+        </w:rPr>
+        <w:t xml:space="preserve"> </w:t>
+      </w:r>
+      <w:proofErr w:type="spellStart"/>
+      <w:proofErr w:type="gramStart"/>
+      <w:r>
+        <w:rPr>
+          <w:color w:val="C00000"/>
+        </w:rPr>
+        <w:t>minhacnhonline.service</w:t>
+      </w:r>
+      <w:proofErr w:type="spellEnd"/>
+      <w:proofErr w:type="gramEnd"/>
+      <w:r>
+        <w:rPr>
+          <w:color w:val="C00000"/>
+        </w:rPr>
+        <w:t> sem que uma senha seja solicitada.</w:t>
+      </w:r>
+    </w:p>
+    <w:p>
+      <w:pPr>
+        <w:ind w:left="708"/>
+        <w:rPr>
+          <w:i/>
+          <w:iCs/>
+        </w:rPr>
+      </w:pPr>
+      <w:proofErr w:type="spellStart"/>
+      <w:r>
+        <w:rPr>
+          <w:i/>
+          <w:iCs/>
+        </w:rPr>
+        <w:t>echo</w:t>
+      </w:r>
+      <w:proofErr w:type="spellEnd"/>
+      <w:r>
+        <w:rPr>
+          <w:i/>
+          <w:iCs/>
+        </w:rPr>
+        <w:t xml:space="preserve"> 'multimidia ALL=NOPASSWD: /bin/</w:t>
+      </w:r>
+      <w:proofErr w:type="spellStart"/>
+      <w:r>
+        <w:rPr>
+          <w:i/>
+          <w:iCs/>
+        </w:rPr>
+        <w:t>systemctl</w:t>
+      </w:r>
+      <w:proofErr w:type="spellEnd"/>
+      <w:r>
+        <w:rPr>
+          <w:i/>
+          <w:iCs/>
+        </w:rPr>
+        <w:t xml:space="preserve"> </w:t>
+      </w:r>
+      <w:proofErr w:type="spellStart"/>
+      <w:r>
+        <w:rPr>
+          <w:i/>
+          <w:iCs/>
+        </w:rPr>
+        <w:t>restart</w:t>
+      </w:r>
+      <w:proofErr w:type="spellEnd"/>
+      <w:r>
+        <w:rPr>
+          <w:i/>
+          <w:iCs/>
+        </w:rPr>
+        <w:t xml:space="preserve"> </w:t>
+      </w:r>
+      <w:proofErr w:type="spellStart"/>
+      <w:proofErr w:type="gramStart"/>
+      <w:r>
+        <w:rPr>
+          <w:i/>
+          <w:iCs/>
+        </w:rPr>
+        <w:t>minhacnhonline.service</w:t>
+      </w:r>
+      <w:proofErr w:type="spellEnd"/>
+      <w:proofErr w:type="gramEnd"/>
+      <w:r>
+        <w:rPr>
+          <w:i/>
+          <w:iCs/>
+        </w:rPr>
+        <w:t xml:space="preserve">' | </w:t>
+      </w:r>
+      <w:proofErr w:type="spellStart"/>
+      <w:r>
+        <w:rPr>
+          <w:i/>
+          <w:iCs/>
+        </w:rPr>
+        <w:t>sudo</w:t>
+      </w:r>
+      <w:proofErr w:type="spellEnd"/>
+      <w:r>
+        <w:rPr>
+          <w:i/>
+          <w:iCs/>
+        </w:rPr>
+        <w:t xml:space="preserve"> </w:t>
+      </w:r>
+      <w:proofErr w:type="spellStart"/>
+      <w:r>
+        <w:rPr>
+          <w:i/>
+          <w:iCs/>
+        </w:rPr>
+        <w:t>tee</w:t>
+      </w:r>
+      <w:proofErr w:type="spellEnd"/>
+      <w:r>
+        <w:rPr>
+          <w:i/>
+          <w:iCs/>
+        </w:rPr>
+        <w:t xml:space="preserve"> /</w:t>
+      </w:r>
+      <w:proofErr w:type="spellStart"/>
+      <w:r>
+        <w:rPr>
+          <w:i/>
+          <w:iCs/>
+        </w:rPr>
+        <w:t>etc</w:t>
+      </w:r>
+      <w:proofErr w:type="spellEnd"/>
+      <w:r>
+        <w:rPr>
+          <w:i/>
+          <w:iCs/>
+        </w:rPr>
+        <w:t>/</w:t>
+      </w:r>
+      <w:proofErr w:type="spellStart"/>
+      <w:proofErr w:type="gramStart"/>
+      <w:r>
+        <w:rPr>
+          <w:i/>
+          <w:iCs/>
+        </w:rPr>
+        <w:t>sudoers.d</w:t>
+      </w:r>
+      <w:proofErr w:type="spellEnd"/>
+      <w:proofErr w:type="gramEnd"/>
+      <w:r>
+        <w:rPr>
+          <w:i/>
+          <w:iCs/>
+        </w:rPr>
+        <w:t>/</w:t>
+      </w:r>
+      <w:proofErr w:type="spellStart"/>
+      <w:r>
+        <w:rPr>
+          <w:i/>
+          <w:iCs/>
+        </w:rPr>
         <w:t>minhacnhonline</w:t>
       </w:r>
       <w:proofErr w:type="spellEnd"/>
-      <w:r>
+    </w:p>
+    <w:p>
+      <w:pPr>
         <w:rPr>
           <w:color w:val="C00000"/>
         </w:rPr>
-        <w:t> dentro de /</w:t>
-      </w:r>
-      <w:proofErr w:type="spellStart"/>
+      </w:pPr>
       <w:r>
         <w:rPr>
           <w:color w:val="C00000"/>
         </w:rPr>
+        <w:t>Este comando ajusta as permissões do arquivo que acabamos de criar.</w:t>
+      </w:r>
+    </w:p>
+    <w:p>
+      <w:pPr>
+        <w:ind w:firstLine="708"/>
+        <w:rPr>
+          <w:i/>
+          <w:iCs/>
+        </w:rPr>
+      </w:pPr>
+      <w:proofErr w:type="spellStart"/>
+      <w:r>
+        <w:rPr>
+          <w:i/>
+          <w:iCs/>
+        </w:rPr>
+        <w:t>sudo</w:t>
+      </w:r>
+      <w:proofErr w:type="spellEnd"/>
+      <w:r>
+        <w:rPr>
+          <w:i/>
+          <w:iCs/>
+        </w:rPr>
+        <w:t xml:space="preserve"> </w:t>
+      </w:r>
+      <w:proofErr w:type="spellStart"/>
+      <w:r>
+        <w:rPr>
+          <w:i/>
+          <w:iCs/>
+        </w:rPr>
+        <w:t>chmod</w:t>
+      </w:r>
+      <w:proofErr w:type="spellEnd"/>
+      <w:r>
+        <w:rPr>
+          <w:i/>
+          <w:iCs/>
+        </w:rPr>
+        <w:t xml:space="preserve"> 440 /</w:t>
+      </w:r>
+      <w:proofErr w:type="spellStart"/>
+      <w:r>
+        <w:rPr>
+          <w:i/>
+          <w:iCs/>
+        </w:rPr>
         <w:t>etc</w:t>
       </w:r>
       <w:proofErr w:type="spellEnd"/>
       <w:r>
         <w:rPr>
+          <w:i/>
+          <w:iCs/>
+        </w:rPr>
+        <w:t>/</w:t>
+      </w:r>
+      <w:proofErr w:type="spellStart"/>
+      <w:proofErr w:type="gramStart"/>
+      <w:r>
+        <w:rPr>
+          <w:i/>
+          <w:iCs/>
+        </w:rPr>
+        <w:t>sudoers.d</w:t>
+      </w:r>
+      <w:proofErr w:type="spellEnd"/>
+      <w:proofErr w:type="gramEnd"/>
+      <w:r>
+        <w:rPr>
+          <w:i/>
+          <w:iCs/>
+        </w:rPr>
+        <w:t>/</w:t>
+      </w:r>
+      <w:proofErr w:type="spellStart"/>
+      <w:r>
+        <w:rPr>
+          <w:i/>
+          <w:iCs/>
+        </w:rPr>
+        <w:t>minhacnhonline</w:t>
+      </w:r>
+      <w:proofErr w:type="spellEnd"/>
+    </w:p>
+    <w:p>
+      <w:pPr>
+        <w:rPr>
+          <w:b/>
+          <w:bCs/>
+        </w:rPr>
+      </w:pPr>
+    </w:p>
+    <w:p>
+      <w:pPr>
+        <w:rPr>
+          <w:b/>
+          <w:bCs/>
+          <w:i/>
+          <w:iCs/>
           <w:color w:val="C00000"/>
         </w:rPr>
-        <w:t>/</w:t>
-      </w:r>
-      <w:proofErr w:type="spellStart"/>
-      <w:proofErr w:type="gramStart"/>
-      <w:r>
-        <w:rPr>
+      </w:pPr>
+      <w:r>
+        <w:rPr>
+          <w:b/>
+          <w:bCs/>
+          <w:i/>
+          <w:iCs/>
           <w:color w:val="C00000"/>
         </w:rPr>
-        <w:t>sudoers.d</w:t>
-      </w:r>
-      <w:proofErr w:type="spellEnd"/>
-      <w:proofErr w:type="gramEnd"/>
-      <w:r>
-        <w:rPr>
+        <w:t xml:space="preserve">14. </w:t>
+      </w:r>
+      <w:r>
+        <w:rPr>
+          <w:b/>
+          <w:bCs/>
+          <w:i/>
+          <w:iCs/>
           <w:color w:val="C00000"/>
         </w:rPr>
-        <w:t>/ e insere uma regra que permite ao usuário multimidia executar o comando </w:t>
-      </w:r>
-      <w:proofErr w:type="spellStart"/>
-      <w:r>
-        <w:rPr>
+        <w:t xml:space="preserve">Criar o serviço </w:t>
+      </w:r>
+      <w:proofErr w:type="spellStart"/>
+      <w:r>
+        <w:rPr>
+          <w:b/>
+          <w:bCs/>
+          <w:i/>
+          <w:iCs/>
           <w:color w:val="C00000"/>
         </w:rPr>
+        <w:t>systemd</w:t>
+      </w:r>
+      <w:proofErr w:type="spellEnd"/>
+      <w:r>
+        <w:rPr>
+          <w:b/>
+          <w:bCs/>
+          <w:i/>
+          <w:iCs/>
+          <w:color w:val="C00000"/>
+        </w:rPr>
+        <w:t xml:space="preserve"> do </w:t>
+      </w:r>
+      <w:proofErr w:type="spellStart"/>
+      <w:r>
+        <w:rPr>
+          <w:b/>
+          <w:bCs/>
+          <w:i/>
+          <w:iCs/>
+          <w:color w:val="C00000"/>
+        </w:rPr>
+        <w:t>Gunicorn</w:t>
+      </w:r>
+      <w:proofErr w:type="spellEnd"/>
+    </w:p>
+    <w:p>
+      <w:pPr>
+        <w:ind w:firstLine="708"/>
+        <w:rPr>
+          <w:i/>
+          <w:iCs/>
+        </w:rPr>
+      </w:pPr>
+      <w:proofErr w:type="spellStart"/>
+      <w:r>
+        <w:rPr>
+          <w:i/>
+          <w:iCs/>
+        </w:rPr>
         <w:t>sudo</w:t>
       </w:r>
       <w:proofErr w:type="spellEnd"/>
       <w:r>
         <w:rPr>
-          <w:color w:val="C00000"/>
-        </w:rPr>
-        <w:t xml:space="preserve"> </w:t>
-      </w:r>
-      <w:proofErr w:type="spellStart"/>
-      <w:r>
-        <w:rPr>
-          <w:color w:val="C00000"/>
-        </w:rPr>
-        <w:t>systemctl</w:t>
-      </w:r>
-      <w:proofErr w:type="spellEnd"/>
-      <w:r>
-        <w:rPr>
-          <w:color w:val="C00000"/>
-        </w:rPr>
-        <w:t xml:space="preserve"> </w:t>
-      </w:r>
-      <w:proofErr w:type="spellStart"/>
-      <w:r>
-        <w:rPr>
-          <w:color w:val="C00000"/>
-        </w:rPr>
-        <w:t>restart</w:t>
-      </w:r>
-      <w:proofErr w:type="spellEnd"/>
-      <w:r>
-        <w:rPr>
-          <w:color w:val="C00000"/>
-        </w:rPr>
-        <w:t xml:space="preserve"> </w:t>
-      </w:r>
-      <w:proofErr w:type="spellStart"/>
-      <w:proofErr w:type="gramStart"/>
-      <w:r>
-        <w:rPr>
-          <w:color w:val="C00000"/>
-        </w:rPr>
-        <w:t>minhacnhonline.service</w:t>
-      </w:r>
-      <w:proofErr w:type="spellEnd"/>
-      <w:proofErr w:type="gramEnd"/>
-      <w:r>
-        <w:rPr>
-          <w:color w:val="C00000"/>
-        </w:rPr>
-        <w:t> sem que uma senha seja solicitada.</w:t>
-      </w:r>
-    </w:p>
-    <w:p>
-      <w:pPr>
-        <w:ind w:left="708"/>
-        <w:rPr>
-          <w:i/>
-          <w:iCs/>
-        </w:rPr>
-      </w:pPr>
-      <w:proofErr w:type="spellStart"/>
-      <w:r>
-        <w:rPr>
-          <w:i/>
-          <w:iCs/>
-        </w:rPr>
-        <w:t>echo</w:t>
-      </w:r>
-      <w:proofErr w:type="spellEnd"/>
-      <w:r>
-        <w:rPr>
-          <w:i/>
-          <w:iCs/>
-        </w:rPr>
-        <w:t xml:space="preserve"> 'multimidia ALL=NOPASSWD: /bin/</w:t>
-      </w:r>
-      <w:proofErr w:type="spellStart"/>
-      <w:r>
-        <w:rPr>
-          <w:i/>
-          <w:iCs/>
-        </w:rPr>
-        <w:t>systemctl</w:t>
-      </w:r>
-      <w:proofErr w:type="spellEnd"/>
-      <w:r>
-        <w:rPr>
-          <w:i/>
-          <w:iCs/>
-        </w:rPr>
-        <w:t xml:space="preserve"> </w:t>
-      </w:r>
-      <w:proofErr w:type="spellStart"/>
-      <w:r>
-        <w:rPr>
-          <w:i/>
-          <w:iCs/>
-        </w:rPr>
-        <w:t>restart</w:t>
-      </w:r>
-      <w:proofErr w:type="spellEnd"/>
-      <w:r>
-        <w:rPr>
-          <w:i/>
-          <w:iCs/>
-        </w:rPr>
-        <w:t xml:space="preserve"> </w:t>
-      </w:r>
-      <w:proofErr w:type="spellStart"/>
-      <w:proofErr w:type="gramStart"/>
-      <w:r>
-        <w:rPr>
-          <w:i/>
-          <w:iCs/>
-        </w:rPr>
-        <w:t>minhacnhonline.service</w:t>
-      </w:r>
-      <w:proofErr w:type="spellEnd"/>
-      <w:proofErr w:type="gramEnd"/>
-      <w:r>
-        <w:rPr>
-          <w:i/>
-          <w:iCs/>
-        </w:rPr>
-        <w:t xml:space="preserve">' | </w:t>
-      </w:r>
-      <w:proofErr w:type="spellStart"/>
-      <w:r>
-        <w:rPr>
-          <w:i/>
-          <w:iCs/>
-        </w:rPr>
-        <w:t>sudo</w:t>
-      </w:r>
-      <w:proofErr w:type="spellEnd"/>
-      <w:r>
-        <w:rPr>
-          <w:i/>
-          <w:iCs/>
-        </w:rPr>
-        <w:t xml:space="preserve"> </w:t>
-      </w:r>
-      <w:proofErr w:type="spellStart"/>
-      <w:r>
-        <w:rPr>
-          <w:i/>
-          <w:iCs/>
-        </w:rPr>
-        <w:t>tee</w:t>
-      </w:r>
-      <w:proofErr w:type="spellEnd"/>
-      <w:r>
-        <w:rPr>
-          <w:i/>
-          <w:iCs/>
-        </w:rPr>
-        <w:t xml:space="preserve"> /</w:t>
-      </w:r>
-      <w:proofErr w:type="spellStart"/>
-      <w:r>
-        <w:rPr>
-          <w:i/>
-          <w:iCs/>
-        </w:rPr>
-        <w:t>etc</w:t>
-      </w:r>
-      <w:proofErr w:type="spellEnd"/>
-      <w:r>
-        <w:rPr>
-          <w:i/>
-          <w:iCs/>
-        </w:rPr>
-        <w:t>/</w:t>
-      </w:r>
-      <w:proofErr w:type="spellStart"/>
-      <w:proofErr w:type="gramStart"/>
-      <w:r>
-        <w:rPr>
-          <w:i/>
-          <w:iCs/>
-        </w:rPr>
-        <w:t>sudoers.d</w:t>
-      </w:r>
-      <w:proofErr w:type="spellEnd"/>
-      <w:proofErr w:type="gramEnd"/>
-      <w:r>
-        <w:rPr>
-          <w:i/>
-          <w:iCs/>
-        </w:rPr>
-        <w:t>/</w:t>
-      </w:r>
-      <w:proofErr w:type="spellStart"/>
-      <w:r>
-        <w:rPr>
-          <w:i/>
-          <w:iCs/>
-        </w:rPr>
-        <w:t>minhacnhonline</w:t>
-      </w:r>
-      <w:proofErr w:type="spellEnd"/>
-    </w:p>
-    <w:p>
-      <w:pPr>
-        <w:rPr>
-          <w:color w:val="C00000"/>
-        </w:rPr>
-      </w:pPr>
-      <w:r>
-        <w:rPr>
-          <w:color w:val="C00000"/>
-        </w:rPr>
-        <w:t>Este comando ajusta as permissões do arquivo que acabamos de criar.</w:t>
-      </w:r>
-    </w:p>
-    <w:p>
-      <w:pPr>
-        <w:ind w:firstLine="708"/>
-        <w:rPr>
-          <w:i/>
-          <w:iCs/>
-        </w:rPr>
-      </w:pPr>
-      <w:proofErr w:type="spellStart"/>
-      <w:r>
-        <w:rPr>
-          <w:i/>
-          <w:iCs/>
-        </w:rPr>
-        <w:t>sudo</w:t>
-      </w:r>
-      <w:proofErr w:type="spellEnd"/>
-      <w:r>
-        <w:rPr>
-          <w:i/>
-          <w:iCs/>
-        </w:rPr>
-        <w:t xml:space="preserve"> </w:t>
-      </w:r>
-      <w:proofErr w:type="spellStart"/>
-      <w:r>
-        <w:rPr>
-          <w:i/>
-          <w:iCs/>
-        </w:rPr>
-        <w:t>chmod</w:t>
-      </w:r>
-      <w:proofErr w:type="spellEnd"/>
-      <w:r>
-        <w:rPr>
-          <w:i/>
-          <w:iCs/>
-        </w:rPr>
-        <w:t xml:space="preserve"> 440 /</w:t>
-      </w:r>
-      <w:proofErr w:type="spellStart"/>
-      <w:r>
-        <w:rPr>
-          <w:i/>
-          <w:iCs/>
-        </w:rPr>
-        <w:t>etc</w:t>
-      </w:r>
-      <w:proofErr w:type="spellEnd"/>
-      <w:r>
-        <w:rPr>
-          <w:i/>
-          <w:iCs/>
-        </w:rPr>
-        <w:t>/</w:t>
-      </w:r>
-      <w:proofErr w:type="spellStart"/>
-      <w:proofErr w:type="gramStart"/>
-      <w:r>
-        <w:rPr>
-          <w:i/>
-          <w:iCs/>
-        </w:rPr>
-        <w:t>sudoers.d</w:t>
-      </w:r>
-      <w:proofErr w:type="spellEnd"/>
-      <w:proofErr w:type="gramEnd"/>
-      <w:r>
-        <w:rPr>
-          <w:i/>
-          <w:iCs/>
-        </w:rPr>
-        <w:t>/</w:t>
-      </w:r>
-      <w:proofErr w:type="spellStart"/>
-      <w:r>
-        <w:rPr>
-          <w:i/>
-          <w:iCs/>
-        </w:rPr>
-        <w:t>minhacnhonline</w:t>
-      </w:r>
-      <w:proofErr w:type="spellEnd"/>
-    </w:p>
-    <w:p>
-      <w:pPr>
-        <w:rPr>
-          <w:b/>
-          <w:bCs/>
-        </w:rPr>
-      </w:pPr>
-    </w:p>
-    <w:p>
-      <w:pPr>
-        <w:rPr>
-          <w:b/>
-          <w:bCs/>
-          <w:i/>
-          <w:iCs/>
-          <w:color w:val="C00000"/>
-        </w:rPr>
-      </w:pPr>
-      <w:r>
-        <w:rPr>
-          <w:b/>
-          <w:bCs/>
-          <w:i/>
-          <w:iCs/>
-          <w:color w:val="C00000"/>
-        </w:rPr>
-        <w:t>1</w:t>
-      </w:r>
-      <w:r>
-        <w:rPr>
-          <w:b/>
-          <w:bCs/>
-          <w:i/>
-          <w:iCs/>
-          <w:color w:val="C00000"/>
-        </w:rPr>
-        <w:t>4</w:t>
-      </w:r>
-      <w:r>
-        <w:rPr>
-          <w:b/>
-          <w:bCs/>
-          <w:i/>
-          <w:iCs/>
-          <w:color w:val="C00000"/>
-        </w:rPr>
-        <w:t xml:space="preserve">. </w:t>
-      </w:r>
-      <w:r>
-        <w:rPr>
-          <w:b/>
-          <w:bCs/>
-          <w:i/>
-          <w:iCs/>
-          <w:color w:val="C00000"/>
-        </w:rPr>
-        <w:t xml:space="preserve">Criar o serviço </w:t>
-      </w:r>
-      <w:proofErr w:type="spellStart"/>
-      <w:r>
-        <w:rPr>
-          <w:b/>
-          <w:bCs/>
-          <w:i/>
-          <w:iCs/>
-          <w:color w:val="C00000"/>
-        </w:rPr>
-        <w:t>systemd</w:t>
-      </w:r>
-      <w:proofErr w:type="spellEnd"/>
-      <w:r>
-        <w:rPr>
-          <w:b/>
-          <w:bCs/>
-          <w:i/>
-          <w:iCs/>
-          <w:color w:val="C00000"/>
-        </w:rPr>
-        <w:t xml:space="preserve"> do </w:t>
-      </w:r>
-      <w:proofErr w:type="spellStart"/>
-      <w:r>
-        <w:rPr>
-          <w:b/>
-          <w:bCs/>
-          <w:i/>
-          <w:iCs/>
-          <w:color w:val="C00000"/>
-        </w:rPr>
-        <w:t>Gunicorn</w:t>
-      </w:r>
-      <w:proofErr w:type="spellEnd"/>
-    </w:p>
-    <w:p>
-      <w:pPr>
-        <w:ind w:firstLine="708"/>
-        <w:rPr>
-          <w:i/>
-          <w:iCs/>
-        </w:rPr>
-      </w:pPr>
-      <w:proofErr w:type="spellStart"/>
-      <w:r>
-        <w:rPr>
-          <w:i/>
-          <w:iCs/>
-        </w:rPr>
-        <w:t>sudo</w:t>
-      </w:r>
-      <w:proofErr w:type="spellEnd"/>
-      <w:r>
-        <w:rPr>
-          <w:i/>
-          <w:iCs/>
-        </w:rPr>
-        <w:t xml:space="preserve"> nano </w:t>
-      </w:r>
-      <w:r>
-        <w:rPr>
-          <w:i/>
-          <w:iCs/>
-        </w:rPr>
-        <w:t>/</w:t>
+          <w:i/>
+          <w:iCs/>
+        </w:rPr>
+        <w:t xml:space="preserve"> nano /</w:t>
       </w:r>
       <w:proofErr w:type="spellStart"/>
       <w:r>
@@ -18340,27 +18254,7 @@
           <w:iCs/>
           <w:color w:val="C00000"/>
         </w:rPr>
-        <w:t>1</w:t>
-      </w:r>
-      <w:r>
-        <w:rPr>
-          <w:b/>
-          <w:bCs/>
-          <w:i/>
-          <w:iCs/>
-          <w:color w:val="C00000"/>
-        </w:rPr>
-        <w:t>5</w:t>
-      </w:r>
-      <w:r>
-        <w:rPr>
-          <w:b/>
-          <w:bCs/>
-          <w:i/>
-          <w:iCs/>
-          <w:color w:val="C00000"/>
-        </w:rPr>
-        <w:t xml:space="preserve">. </w:t>
+        <w:t xml:space="preserve">15. </w:t>
       </w:r>
       <w:r>
         <w:rPr>
@@ -19912,6 +19806,3513 @@
         </w:rPr>
         <w:t xml:space="preserve"> cuida do seu domínio.</w:t>
       </w:r>
+    </w:p>
+    <w:p>
+      <w:pPr>
+        <w:rPr>
+          <w:b/>
+          <w:bCs/>
+          <w:color w:val="C00000"/>
+        </w:rPr>
+      </w:pPr>
+    </w:p>
+    <w:p>
+      <w:pPr>
+        <w:rPr>
+          <w:b/>
+          <w:bCs/>
+          <w:i/>
+          <w:iCs/>
+          <w:color w:val="C00000"/>
+        </w:rPr>
+      </w:pPr>
+      <w:r>
+        <w:rPr>
+          <w:b/>
+          <w:bCs/>
+          <w:i/>
+          <w:iCs/>
+          <w:color w:val="C00000"/>
+        </w:rPr>
+        <w:t>1</w:t>
+      </w:r>
+      <w:r>
+        <w:rPr>
+          <w:b/>
+          <w:bCs/>
+          <w:i/>
+          <w:iCs/>
+          <w:color w:val="C00000"/>
+        </w:rPr>
+        <w:t>6</w:t>
+      </w:r>
+      <w:r>
+        <w:rPr>
+          <w:b/>
+          <w:bCs/>
+          <w:i/>
+          <w:iCs/>
+          <w:color w:val="C00000"/>
+        </w:rPr>
+        <w:t xml:space="preserve">. </w:t>
+      </w:r>
+      <w:r>
+        <w:rPr>
+          <w:b/>
+          <w:bCs/>
+          <w:i/>
+          <w:iCs/>
+          <w:color w:val="C00000"/>
+        </w:rPr>
+        <w:t xml:space="preserve">Conecte seu repositório local ao </w:t>
+      </w:r>
+      <w:proofErr w:type="spellStart"/>
+      <w:r>
+        <w:rPr>
+          <w:b/>
+          <w:bCs/>
+          <w:i/>
+          <w:iCs/>
+          <w:color w:val="C00000"/>
+        </w:rPr>
+        <w:t>bare</w:t>
+      </w:r>
+      <w:proofErr w:type="spellEnd"/>
+      <w:r>
+        <w:rPr>
+          <w:b/>
+          <w:bCs/>
+          <w:i/>
+          <w:iCs/>
+          <w:color w:val="C00000"/>
+        </w:rPr>
+        <w:t xml:space="preserve"> da VPS e faça o primeiro </w:t>
+      </w:r>
+      <w:proofErr w:type="spellStart"/>
+      <w:r>
+        <w:rPr>
+          <w:b/>
+          <w:bCs/>
+          <w:i/>
+          <w:iCs/>
+          <w:color w:val="C00000"/>
+        </w:rPr>
+        <w:t>push</w:t>
+      </w:r>
+      <w:proofErr w:type="spellEnd"/>
+      <w:r>
+        <w:rPr>
+          <w:b/>
+          <w:bCs/>
+          <w:i/>
+          <w:iCs/>
+          <w:color w:val="C00000"/>
+        </w:rPr>
+        <w:t>:</w:t>
+      </w:r>
+    </w:p>
+    <w:p>
+      <w:r>
+        <w:t xml:space="preserve">No seu PC (no </w:t>
+      </w:r>
+      <w:proofErr w:type="spellStart"/>
+      <w:r>
+        <w:t>repo</w:t>
+      </w:r>
+      <w:proofErr w:type="spellEnd"/>
+      <w:r>
+        <w:t xml:space="preserve"> do projeto):</w:t>
+      </w:r>
+    </w:p>
+    <w:p>
+      <w:pPr>
+        <w:ind w:left="708"/>
+        <w:rPr>
+          <w:i/>
+          <w:iCs/>
+        </w:rPr>
+      </w:pPr>
+      <w:proofErr w:type="spellStart"/>
+      <w:r>
+        <w:rPr>
+          <w:i/>
+          <w:iCs/>
+        </w:rPr>
+        <w:t>git</w:t>
+      </w:r>
+      <w:proofErr w:type="spellEnd"/>
+      <w:r>
+        <w:rPr>
+          <w:i/>
+          <w:iCs/>
+        </w:rPr>
+        <w:t xml:space="preserve"> </w:t>
+      </w:r>
+      <w:proofErr w:type="spellStart"/>
+      <w:r>
+        <w:rPr>
+          <w:i/>
+          <w:iCs/>
+        </w:rPr>
+        <w:t>remote</w:t>
+      </w:r>
+      <w:proofErr w:type="spellEnd"/>
+      <w:r>
+        <w:rPr>
+          <w:i/>
+          <w:iCs/>
+        </w:rPr>
+        <w:t xml:space="preserve"> </w:t>
+      </w:r>
+      <w:proofErr w:type="spellStart"/>
+      <w:r>
+        <w:rPr>
+          <w:i/>
+          <w:iCs/>
+        </w:rPr>
+        <w:t>add</w:t>
+      </w:r>
+      <w:proofErr w:type="spellEnd"/>
+      <w:r>
+        <w:rPr>
+          <w:i/>
+          <w:iCs/>
+        </w:rPr>
+        <w:t xml:space="preserve"> </w:t>
+      </w:r>
+      <w:proofErr w:type="spellStart"/>
+      <w:r>
+        <w:rPr>
+          <w:i/>
+          <w:iCs/>
+        </w:rPr>
+        <w:t>prod</w:t>
+      </w:r>
+      <w:proofErr w:type="spellEnd"/>
+      <w:r>
+        <w:rPr>
+          <w:i/>
+          <w:iCs/>
+        </w:rPr>
+        <w:t xml:space="preserve"> ssh://multimidia@178.156.147.79:/srv/git/minhacnhonline.git</w:t>
+      </w:r>
+    </w:p>
+    <w:p>
+      <w:pPr>
+        <w:ind w:left="708"/>
+        <w:rPr>
+          <w:i/>
+          <w:iCs/>
+        </w:rPr>
+      </w:pPr>
+      <w:proofErr w:type="spellStart"/>
+      <w:r>
+        <w:rPr>
+          <w:i/>
+          <w:iCs/>
+        </w:rPr>
+        <w:t>git</w:t>
+      </w:r>
+      <w:proofErr w:type="spellEnd"/>
+      <w:r>
+        <w:rPr>
+          <w:i/>
+          <w:iCs/>
+        </w:rPr>
+        <w:t xml:space="preserve"> </w:t>
+      </w:r>
+      <w:proofErr w:type="spellStart"/>
+      <w:r>
+        <w:rPr>
+          <w:i/>
+          <w:iCs/>
+        </w:rPr>
+        <w:t>branch</w:t>
+      </w:r>
+      <w:proofErr w:type="spellEnd"/>
+      <w:r>
+        <w:rPr>
+          <w:i/>
+          <w:iCs/>
+        </w:rPr>
+        <w:t xml:space="preserve"> -M </w:t>
+      </w:r>
+      <w:proofErr w:type="spellStart"/>
+      <w:r>
+        <w:rPr>
+          <w:i/>
+          <w:iCs/>
+        </w:rPr>
+        <w:t>main</w:t>
+      </w:r>
+      <w:proofErr w:type="spellEnd"/>
+    </w:p>
+    <w:p>
+      <w:pPr>
+        <w:ind w:left="708"/>
+        <w:rPr>
+          <w:i/>
+          <w:iCs/>
+        </w:rPr>
+      </w:pPr>
+      <w:proofErr w:type="spellStart"/>
+      <w:r>
+        <w:rPr>
+          <w:i/>
+          <w:iCs/>
+        </w:rPr>
+        <w:t>git</w:t>
+      </w:r>
+      <w:proofErr w:type="spellEnd"/>
+      <w:r>
+        <w:rPr>
+          <w:i/>
+          <w:iCs/>
+        </w:rPr>
+        <w:t xml:space="preserve"> </w:t>
+      </w:r>
+      <w:proofErr w:type="spellStart"/>
+      <w:r>
+        <w:rPr>
+          <w:i/>
+          <w:iCs/>
+        </w:rPr>
+        <w:t>push</w:t>
+      </w:r>
+      <w:proofErr w:type="spellEnd"/>
+      <w:r>
+        <w:rPr>
+          <w:i/>
+          <w:iCs/>
+        </w:rPr>
+        <w:t xml:space="preserve"> </w:t>
+      </w:r>
+      <w:proofErr w:type="spellStart"/>
+      <w:r>
+        <w:rPr>
+          <w:i/>
+          <w:iCs/>
+        </w:rPr>
+        <w:t>prod</w:t>
+      </w:r>
+      <w:proofErr w:type="spellEnd"/>
+      <w:r>
+        <w:rPr>
+          <w:i/>
+          <w:iCs/>
+        </w:rPr>
+        <w:t xml:space="preserve"> </w:t>
+      </w:r>
+      <w:proofErr w:type="spellStart"/>
+      <w:r>
+        <w:rPr>
+          <w:i/>
+          <w:iCs/>
+        </w:rPr>
+        <w:t>main</w:t>
+      </w:r>
+      <w:proofErr w:type="spellEnd"/>
+    </w:p>
+    <w:p>
+      <w:pPr>
+        <w:ind w:left="708"/>
+        <w:rPr>
+          <w:i/>
+          <w:iCs/>
+        </w:rPr>
+      </w:pPr>
+    </w:p>
+    <w:p>
+      <w:pPr>
+        <w:ind w:left="708"/>
+        <w:rPr>
+          <w:i/>
+          <w:iCs/>
+        </w:rPr>
+      </w:pPr>
+      <w:r>
+        <w:rPr>
+          <w:i/>
+          <w:iCs/>
+        </w:rPr>
+        <w:t>IMPORTANTE: considerando que o usuário “multimidia” não está liberado via SSH, ser</w:t>
+      </w:r>
+      <w:r>
+        <w:rPr>
+          <w:i/>
+          <w:iCs/>
+        </w:rPr>
+        <w:t>á</w:t>
+      </w:r>
+      <w:r>
+        <w:rPr>
+          <w:i/>
+          <w:iCs/>
+        </w:rPr>
+        <w:t xml:space="preserve"> pedido a senha, que </w:t>
+      </w:r>
+      <w:proofErr w:type="spellStart"/>
+      <w:proofErr w:type="gramStart"/>
+      <w:r>
+        <w:rPr>
+          <w:i/>
+          <w:iCs/>
+        </w:rPr>
+        <w:t>nesta</w:t>
+      </w:r>
+      <w:proofErr w:type="spellEnd"/>
+      <w:r>
+        <w:rPr>
+          <w:i/>
+          <w:iCs/>
+        </w:rPr>
+        <w:t xml:space="preserve"> caso</w:t>
+      </w:r>
+      <w:proofErr w:type="gramEnd"/>
+      <w:r>
+        <w:rPr>
+          <w:i/>
+          <w:iCs/>
+        </w:rPr>
+        <w:t xml:space="preserve"> é </w:t>
+      </w:r>
+      <w:r>
+        <w:rPr>
+          <w:b/>
+          <w:bCs/>
+          <w:i/>
+          <w:iCs/>
+          <w:color w:val="EE0000"/>
+        </w:rPr>
+        <w:t>“@Ale240471</w:t>
+      </w:r>
+      <w:r>
+        <w:rPr>
+          <w:i/>
+          <w:iCs/>
+        </w:rPr>
+        <w:t>”</w:t>
+      </w:r>
+    </w:p>
+    <w:p>
+      <w:pPr>
+        <w:ind w:left="708"/>
+        <w:rPr>
+          <w:i/>
+          <w:iCs/>
+        </w:rPr>
+      </w:pPr>
+    </w:p>
+    <w:p>
+      <w:pPr>
+        <w:ind w:left="708"/>
+        <w:rPr>
+          <w:i/>
+          <w:iCs/>
+        </w:rPr>
+      </w:pPr>
+      <w:r>
+        <w:rPr>
+          <w:i/>
+          <w:iCs/>
+        </w:rPr>
+        <w:t xml:space="preserve">O </w:t>
+      </w:r>
+      <w:proofErr w:type="spellStart"/>
+      <w:r>
+        <w:rPr>
+          <w:i/>
+          <w:iCs/>
+        </w:rPr>
+        <w:t>hook</w:t>
+      </w:r>
+      <w:proofErr w:type="spellEnd"/>
+      <w:r>
+        <w:rPr>
+          <w:i/>
+          <w:iCs/>
+        </w:rPr>
+        <w:t xml:space="preserve"> vai:</w:t>
+      </w:r>
+    </w:p>
+    <w:p>
+      <w:pPr>
+        <w:numPr>
+          <w:ilvl w:val="0"/>
+          <w:numId w:val="9"/>
+        </w:numPr>
+        <w:rPr>
+          <w:i/>
+          <w:iCs/>
+        </w:rPr>
+      </w:pPr>
+      <w:r>
+        <w:rPr>
+          <w:i/>
+          <w:iCs/>
+        </w:rPr>
+        <w:t xml:space="preserve">fazer </w:t>
+      </w:r>
+      <w:r>
+        <w:rPr>
+          <w:b/>
+          <w:bCs/>
+          <w:i/>
+          <w:iCs/>
+        </w:rPr>
+        <w:t>checkout</w:t>
+      </w:r>
+      <w:r>
+        <w:rPr>
+          <w:i/>
+          <w:iCs/>
+        </w:rPr>
+        <w:t xml:space="preserve"> em /</w:t>
+      </w:r>
+      <w:proofErr w:type="spellStart"/>
+      <w:r>
+        <w:rPr>
+          <w:i/>
+          <w:iCs/>
+        </w:rPr>
+        <w:t>srv</w:t>
+      </w:r>
+      <w:proofErr w:type="spellEnd"/>
+      <w:r>
+        <w:rPr>
+          <w:i/>
+          <w:iCs/>
+        </w:rPr>
+        <w:t>/</w:t>
+      </w:r>
+      <w:proofErr w:type="spellStart"/>
+      <w:r>
+        <w:rPr>
+          <w:i/>
+          <w:iCs/>
+        </w:rPr>
+        <w:t>minhacnhonline</w:t>
+      </w:r>
+      <w:proofErr w:type="spellEnd"/>
+      <w:r>
+        <w:rPr>
+          <w:i/>
+          <w:iCs/>
+        </w:rPr>
+        <w:t>/app,</w:t>
+      </w:r>
+    </w:p>
+    <w:p>
+      <w:pPr>
+        <w:numPr>
+          <w:ilvl w:val="0"/>
+          <w:numId w:val="9"/>
+        </w:numPr>
+        <w:rPr>
+          <w:i/>
+          <w:iCs/>
+        </w:rPr>
+      </w:pPr>
+      <w:r>
+        <w:rPr>
+          <w:i/>
+          <w:iCs/>
+        </w:rPr>
+        <w:t xml:space="preserve">instalar </w:t>
+      </w:r>
+      <w:proofErr w:type="spellStart"/>
+      <w:r>
+        <w:rPr>
+          <w:b/>
+          <w:bCs/>
+          <w:i/>
+          <w:iCs/>
+        </w:rPr>
+        <w:t>requirements</w:t>
+      </w:r>
+      <w:proofErr w:type="spellEnd"/>
+      <w:r>
+        <w:rPr>
+          <w:i/>
+          <w:iCs/>
+        </w:rPr>
+        <w:t>,</w:t>
+      </w:r>
+    </w:p>
+    <w:p>
+      <w:pPr>
+        <w:numPr>
+          <w:ilvl w:val="0"/>
+          <w:numId w:val="9"/>
+        </w:numPr>
+        <w:rPr>
+          <w:i/>
+          <w:iCs/>
+        </w:rPr>
+      </w:pPr>
+      <w:r>
+        <w:rPr>
+          <w:i/>
+          <w:iCs/>
+        </w:rPr>
+        <w:t xml:space="preserve">rodar </w:t>
+      </w:r>
+      <w:proofErr w:type="spellStart"/>
+      <w:r>
+        <w:rPr>
+          <w:b/>
+          <w:bCs/>
+          <w:i/>
+          <w:iCs/>
+        </w:rPr>
+        <w:t>migrate</w:t>
+      </w:r>
+      <w:proofErr w:type="spellEnd"/>
+      <w:r>
+        <w:rPr>
+          <w:i/>
+          <w:iCs/>
+        </w:rPr>
+        <w:t xml:space="preserve"> e </w:t>
+      </w:r>
+      <w:proofErr w:type="spellStart"/>
+      <w:r>
+        <w:rPr>
+          <w:b/>
+          <w:bCs/>
+          <w:i/>
+          <w:iCs/>
+        </w:rPr>
+        <w:t>collectstatic</w:t>
+      </w:r>
+      <w:proofErr w:type="spellEnd"/>
+      <w:r>
+        <w:rPr>
+          <w:i/>
+          <w:iCs/>
+        </w:rPr>
+        <w:t>,</w:t>
+      </w:r>
+    </w:p>
+    <w:p>
+      <w:pPr>
+        <w:numPr>
+          <w:ilvl w:val="0"/>
+          <w:numId w:val="9"/>
+        </w:numPr>
+        <w:rPr>
+          <w:i/>
+          <w:iCs/>
+        </w:rPr>
+      </w:pPr>
+      <w:proofErr w:type="spellStart"/>
+      <w:r>
+        <w:rPr>
+          <w:b/>
+          <w:bCs/>
+          <w:i/>
+          <w:iCs/>
+        </w:rPr>
+        <w:t>restart</w:t>
+      </w:r>
+      <w:proofErr w:type="spellEnd"/>
+      <w:r>
+        <w:rPr>
+          <w:i/>
+          <w:iCs/>
+        </w:rPr>
+        <w:t xml:space="preserve"> do serviço.</w:t>
+      </w:r>
+    </w:p>
+    <w:p>
+      <w:pPr>
+        <w:rPr>
+          <w:b/>
+          <w:bCs/>
+          <w:i/>
+          <w:iCs/>
+          <w:color w:val="C00000"/>
+        </w:rPr>
+      </w:pPr>
+      <w:r>
+        <w:rPr>
+          <w:b/>
+          <w:bCs/>
+          <w:i/>
+          <w:iCs/>
+          <w:color w:val="C00000"/>
+        </w:rPr>
+        <w:t xml:space="preserve">16. </w:t>
+      </w:r>
+      <w:r>
+        <w:rPr>
+          <w:b/>
+          <w:bCs/>
+          <w:i/>
+          <w:iCs/>
+          <w:color w:val="C00000"/>
+        </w:rPr>
+        <w:t xml:space="preserve">Tivemos um erro no </w:t>
+      </w:r>
+      <w:proofErr w:type="spellStart"/>
+      <w:r>
+        <w:rPr>
+          <w:b/>
+          <w:bCs/>
+          <w:i/>
+          <w:iCs/>
+          <w:color w:val="C00000"/>
+        </w:rPr>
+        <w:t>ModuleNotFoundError</w:t>
+      </w:r>
+      <w:proofErr w:type="spellEnd"/>
+      <w:r>
+        <w:rPr>
+          <w:b/>
+          <w:bCs/>
+          <w:i/>
+          <w:iCs/>
+          <w:color w:val="C00000"/>
+        </w:rPr>
+        <w:t xml:space="preserve">: No module </w:t>
+      </w:r>
+      <w:proofErr w:type="spellStart"/>
+      <w:r>
+        <w:rPr>
+          <w:b/>
+          <w:bCs/>
+          <w:i/>
+          <w:iCs/>
+          <w:color w:val="C00000"/>
+        </w:rPr>
+        <w:t>named</w:t>
+      </w:r>
+      <w:proofErr w:type="spellEnd"/>
+      <w:r>
+        <w:rPr>
+          <w:b/>
+          <w:bCs/>
+          <w:i/>
+          <w:iCs/>
+          <w:color w:val="C00000"/>
+        </w:rPr>
+        <w:t xml:space="preserve"> '</w:t>
+      </w:r>
+      <w:proofErr w:type="spellStart"/>
+      <w:r>
+        <w:rPr>
+          <w:b/>
+          <w:bCs/>
+          <w:i/>
+          <w:iCs/>
+          <w:color w:val="C00000"/>
+        </w:rPr>
+        <w:t>dj_database_url</w:t>
+      </w:r>
+      <w:proofErr w:type="spellEnd"/>
+      <w:r>
+        <w:rPr>
+          <w:b/>
+          <w:bCs/>
+          <w:i/>
+          <w:iCs/>
+          <w:color w:val="C00000"/>
+        </w:rPr>
+        <w:t>'</w:t>
+      </w:r>
+      <w:r>
+        <w:rPr>
+          <w:b/>
+          <w:bCs/>
+          <w:i/>
+          <w:iCs/>
+          <w:color w:val="C00000"/>
+        </w:rPr>
+        <w:t>, vamos ter que corrigir:</w:t>
+      </w:r>
+    </w:p>
+    <w:p>
+      <w:pPr>
+        <w:rPr>
+          <w:i/>
+          <w:iCs/>
+        </w:rPr>
+      </w:pPr>
+      <w:r>
+        <w:rPr>
+          <w:i/>
+          <w:iCs/>
+        </w:rPr>
+        <w:t xml:space="preserve">e, ao usar </w:t>
+      </w:r>
+      <w:proofErr w:type="spellStart"/>
+      <w:r>
+        <w:rPr>
+          <w:i/>
+          <w:iCs/>
+        </w:rPr>
+        <w:t>Postgres</w:t>
+      </w:r>
+      <w:proofErr w:type="spellEnd"/>
+      <w:r>
+        <w:rPr>
+          <w:i/>
+          <w:iCs/>
+        </w:rPr>
+        <w:t xml:space="preserve">, você também precisará do driver. Vamos corrigir </w:t>
+      </w:r>
+      <w:r>
+        <w:rPr>
+          <w:b/>
+          <w:bCs/>
+          <w:i/>
+          <w:iCs/>
+        </w:rPr>
+        <w:t>já</w:t>
+      </w:r>
+      <w:r>
+        <w:rPr>
+          <w:i/>
+          <w:iCs/>
+        </w:rPr>
+        <w:t>.</w:t>
+      </w:r>
+    </w:p>
+    <w:p>
+      <w:pPr>
+        <w:rPr>
+          <w:b/>
+          <w:bCs/>
+        </w:rPr>
+      </w:pPr>
+      <w:r>
+        <w:rPr>
+          <w:b/>
+          <w:bCs/>
+        </w:rPr>
+        <w:t>a</w:t>
+      </w:r>
+      <w:r>
+        <w:rPr>
+          <w:b/>
+          <w:bCs/>
+        </w:rPr>
+        <w:t xml:space="preserve">) Instale as dependências que faltam no </w:t>
+      </w:r>
+      <w:proofErr w:type="spellStart"/>
+      <w:r>
+        <w:rPr>
+          <w:b/>
+          <w:bCs/>
+        </w:rPr>
+        <w:t>venv</w:t>
+      </w:r>
+      <w:proofErr w:type="spellEnd"/>
+      <w:r>
+        <w:rPr>
+          <w:b/>
+          <w:bCs/>
+        </w:rPr>
+        <w:t xml:space="preserve"> da VPS</w:t>
+      </w:r>
+    </w:p>
+    <w:p>
+      <w:r>
+        <w:t xml:space="preserve">(isso resolve o erro atual e já prepara para o </w:t>
+      </w:r>
+      <w:proofErr w:type="spellStart"/>
+      <w:r>
+        <w:t>Postgres</w:t>
+      </w:r>
+      <w:proofErr w:type="spellEnd"/>
+      <w:r>
+        <w:t>)</w:t>
+      </w:r>
+    </w:p>
+    <w:p>
+      <w:r>
+        <w:t># no manager01</w:t>
+      </w:r>
+    </w:p>
+    <w:p>
+      <w:pPr>
+        <w:ind w:left="708"/>
+        <w:rPr>
+          <w:i/>
+          <w:iCs/>
+        </w:rPr>
+      </w:pPr>
+      <w:proofErr w:type="spellStart"/>
+      <w:r>
+        <w:rPr>
+          <w:i/>
+          <w:iCs/>
+        </w:rPr>
+        <w:t>sudo</w:t>
+      </w:r>
+      <w:proofErr w:type="spellEnd"/>
+      <w:r>
+        <w:rPr>
+          <w:i/>
+          <w:iCs/>
+        </w:rPr>
+        <w:t xml:space="preserve"> -u multimidia -H /</w:t>
+      </w:r>
+      <w:proofErr w:type="spellStart"/>
+      <w:r>
+        <w:rPr>
+          <w:i/>
+          <w:iCs/>
+        </w:rPr>
+        <w:t>srv</w:t>
+      </w:r>
+      <w:proofErr w:type="spellEnd"/>
+      <w:r>
+        <w:rPr>
+          <w:i/>
+          <w:iCs/>
+        </w:rPr>
+        <w:t>/</w:t>
+      </w:r>
+      <w:proofErr w:type="spellStart"/>
+      <w:r>
+        <w:rPr>
+          <w:i/>
+          <w:iCs/>
+        </w:rPr>
+        <w:t>minhacnhonline</w:t>
+      </w:r>
+      <w:proofErr w:type="spellEnd"/>
+      <w:r>
+        <w:rPr>
+          <w:i/>
+          <w:iCs/>
+        </w:rPr>
+        <w:t>/</w:t>
+      </w:r>
+      <w:proofErr w:type="spellStart"/>
+      <w:r>
+        <w:rPr>
+          <w:i/>
+          <w:iCs/>
+        </w:rPr>
+        <w:t>venv</w:t>
+      </w:r>
+      <w:proofErr w:type="spellEnd"/>
+      <w:r>
+        <w:rPr>
+          <w:i/>
+          <w:iCs/>
+        </w:rPr>
+        <w:t>/bin/</w:t>
+      </w:r>
+      <w:proofErr w:type="spellStart"/>
+      <w:r>
+        <w:rPr>
+          <w:i/>
+          <w:iCs/>
+        </w:rPr>
+        <w:t>pip</w:t>
+      </w:r>
+      <w:proofErr w:type="spellEnd"/>
+      <w:r>
+        <w:rPr>
+          <w:i/>
+          <w:iCs/>
+        </w:rPr>
+        <w:t xml:space="preserve"> </w:t>
+      </w:r>
+      <w:proofErr w:type="spellStart"/>
+      <w:r>
+        <w:rPr>
+          <w:i/>
+          <w:iCs/>
+        </w:rPr>
+        <w:t>install</w:t>
+      </w:r>
+      <w:proofErr w:type="spellEnd"/>
+      <w:r>
+        <w:rPr>
+          <w:i/>
+          <w:iCs/>
+        </w:rPr>
+        <w:t xml:space="preserve"> \</w:t>
+      </w:r>
+    </w:p>
+    <w:p>
+      <w:pPr>
+        <w:ind w:left="708"/>
+        <w:rPr>
+          <w:i/>
+          <w:iCs/>
+        </w:rPr>
+      </w:pPr>
+      <w:r>
+        <w:rPr>
+          <w:i/>
+          <w:iCs/>
+        </w:rPr>
+        <w:t xml:space="preserve">  </w:t>
+      </w:r>
+      <w:proofErr w:type="spellStart"/>
+      <w:r>
+        <w:rPr>
+          <w:i/>
+          <w:iCs/>
+        </w:rPr>
+        <w:t>dj-database-url</w:t>
+      </w:r>
+      <w:proofErr w:type="spellEnd"/>
+      <w:r>
+        <w:rPr>
+          <w:i/>
+          <w:iCs/>
+        </w:rPr>
+        <w:t xml:space="preserve"> psycopg2-binary</w:t>
+      </w:r>
+    </w:p>
+    <w:p>
+      <w:pPr>
+        <w:rPr>
+          <w:color w:val="EE0000"/>
+        </w:rPr>
+      </w:pPr>
+      <w:proofErr w:type="spellStart"/>
+      <w:r>
+        <w:rPr>
+          <w:color w:val="EE0000"/>
+        </w:rPr>
+        <w:t>dj-database-url</w:t>
+      </w:r>
+      <w:proofErr w:type="spellEnd"/>
+      <w:r>
+        <w:rPr>
+          <w:color w:val="EE0000"/>
+        </w:rPr>
+        <w:t xml:space="preserve"> faz o parse da DJANGO_DB_URL do </w:t>
+      </w:r>
+      <w:proofErr w:type="gramStart"/>
+      <w:r>
+        <w:rPr>
+          <w:color w:val="EE0000"/>
+        </w:rPr>
+        <w:t>seu .</w:t>
+      </w:r>
+      <w:proofErr w:type="spellStart"/>
+      <w:r>
+        <w:rPr>
+          <w:color w:val="EE0000"/>
+        </w:rPr>
+        <w:t>env</w:t>
+      </w:r>
+      <w:proofErr w:type="spellEnd"/>
+      <w:proofErr w:type="gramEnd"/>
+      <w:r>
+        <w:rPr>
+          <w:color w:val="EE0000"/>
+        </w:rPr>
+        <w:t>.</w:t>
+      </w:r>
+      <w:r>
+        <w:rPr>
+          <w:color w:val="EE0000"/>
+        </w:rPr>
+        <w:br/>
+        <w:t xml:space="preserve">psycopg2-binary é o driver </w:t>
+      </w:r>
+      <w:proofErr w:type="spellStart"/>
+      <w:r>
+        <w:rPr>
+          <w:color w:val="EE0000"/>
+        </w:rPr>
+        <w:t>Postgres</w:t>
+      </w:r>
+      <w:proofErr w:type="spellEnd"/>
+      <w:r>
+        <w:rPr>
+          <w:color w:val="EE0000"/>
+        </w:rPr>
+        <w:t xml:space="preserve"> (prático para </w:t>
+      </w:r>
+      <w:proofErr w:type="spellStart"/>
+      <w:r>
+        <w:rPr>
+          <w:color w:val="EE0000"/>
+        </w:rPr>
+        <w:t>deploy</w:t>
+      </w:r>
+      <w:proofErr w:type="spellEnd"/>
+      <w:r>
+        <w:rPr>
+          <w:color w:val="EE0000"/>
+        </w:rPr>
+        <w:t>).</w:t>
+      </w:r>
+    </w:p>
+    <w:p>
+      <w:r>
+        <w:t xml:space="preserve">IMPORTANTE: esse erro não correrá mais em novos projetos, pois atualizei o requerimento.txt do projeto local com </w:t>
+      </w:r>
+    </w:p>
+    <w:p>
+      <w:pPr>
+        <w:ind w:left="708"/>
+        <w:rPr>
+          <w:color w:val="EE0000"/>
+        </w:rPr>
+      </w:pPr>
+      <w:proofErr w:type="spellStart"/>
+      <w:r>
+        <w:rPr>
+          <w:color w:val="EE0000"/>
+        </w:rPr>
+        <w:t>dj-database-url</w:t>
+      </w:r>
+      <w:proofErr w:type="spellEnd"/>
+    </w:p>
+    <w:p>
+      <w:pPr>
+        <w:ind w:left="708"/>
+        <w:rPr>
+          <w:color w:val="EE0000"/>
+        </w:rPr>
+      </w:pPr>
+      <w:r>
+        <w:rPr>
+          <w:color w:val="EE0000"/>
+        </w:rPr>
+        <w:t>psycopg2-binary</w:t>
+      </w:r>
+    </w:p>
+    <w:p>
+      <w:pPr>
+        <w:ind w:left="708"/>
+        <w:rPr>
+          <w:color w:val="EE0000"/>
+        </w:rPr>
+      </w:pPr>
+      <w:proofErr w:type="spellStart"/>
+      <w:r>
+        <w:rPr>
+          <w:color w:val="EE0000"/>
+        </w:rPr>
+        <w:t>gunicorn</w:t>
+      </w:r>
+      <w:proofErr w:type="spellEnd"/>
+    </w:p>
+    <w:p>
+      <w:pPr>
+        <w:ind w:left="708"/>
+        <w:rPr>
+          <w:color w:val="EE0000"/>
+        </w:rPr>
+      </w:pPr>
+      <w:proofErr w:type="spellStart"/>
+      <w:r>
+        <w:rPr>
+          <w:color w:val="EE0000"/>
+        </w:rPr>
+        <w:t>uvicorn</w:t>
+      </w:r>
+      <w:proofErr w:type="spellEnd"/>
+      <w:r>
+        <w:rPr>
+          <w:color w:val="EE0000"/>
+        </w:rPr>
+        <w:t>[standard]</w:t>
+      </w:r>
+    </w:p>
+    <w:p>
+      <w:pPr>
+        <w:ind w:left="708"/>
+        <w:rPr>
+          <w:color w:val="EE0000"/>
+        </w:rPr>
+      </w:pPr>
+      <w:proofErr w:type="spellStart"/>
+      <w:r>
+        <w:rPr>
+          <w:color w:val="EE0000"/>
+        </w:rPr>
+        <w:t>python-dotenv</w:t>
+      </w:r>
+      <w:proofErr w:type="spellEnd"/>
+    </w:p>
+    <w:p>
+      <w:pPr>
+        <w:rPr>
+          <w:b/>
+          <w:bCs/>
+        </w:rPr>
+      </w:pPr>
+      <w:r>
+        <w:rPr>
+          <w:b/>
+          <w:bCs/>
+        </w:rPr>
+        <w:t>b</w:t>
+      </w:r>
+      <w:r>
+        <w:rPr>
+          <w:b/>
+          <w:bCs/>
+        </w:rPr>
+        <w:t xml:space="preserve">) Teste novamente o </w:t>
+      </w:r>
+      <w:proofErr w:type="spellStart"/>
+      <w:r>
+        <w:rPr>
+          <w:b/>
+          <w:bCs/>
+        </w:rPr>
+        <w:t>Gunicorn</w:t>
+      </w:r>
+      <w:proofErr w:type="spellEnd"/>
+      <w:r>
+        <w:rPr>
+          <w:b/>
+          <w:bCs/>
+        </w:rPr>
+        <w:t xml:space="preserve"> manualmente</w:t>
+      </w:r>
+    </w:p>
+    <w:p>
+      <w:pPr>
+        <w:ind w:left="708"/>
+        <w:rPr>
+          <w:i/>
+          <w:iCs/>
+        </w:rPr>
+      </w:pPr>
+      <w:proofErr w:type="spellStart"/>
+      <w:r>
+        <w:rPr>
+          <w:i/>
+          <w:iCs/>
+        </w:rPr>
+        <w:t>sudo</w:t>
+      </w:r>
+      <w:proofErr w:type="spellEnd"/>
+      <w:r>
+        <w:rPr>
+          <w:i/>
+          <w:iCs/>
+        </w:rPr>
+        <w:t xml:space="preserve"> -u multimidia -H </w:t>
+      </w:r>
+      <w:proofErr w:type="spellStart"/>
+      <w:r>
+        <w:rPr>
+          <w:i/>
+          <w:iCs/>
+        </w:rPr>
+        <w:t>bash</w:t>
+      </w:r>
+      <w:proofErr w:type="spellEnd"/>
+      <w:r>
+        <w:rPr>
+          <w:i/>
+          <w:iCs/>
+        </w:rPr>
+        <w:t xml:space="preserve"> -</w:t>
+      </w:r>
+      <w:proofErr w:type="spellStart"/>
+      <w:r>
+        <w:rPr>
+          <w:i/>
+          <w:iCs/>
+        </w:rPr>
+        <w:t>lc</w:t>
+      </w:r>
+      <w:proofErr w:type="spellEnd"/>
+      <w:r>
+        <w:rPr>
+          <w:i/>
+          <w:iCs/>
+        </w:rPr>
+        <w:t xml:space="preserve"> '</w:t>
+      </w:r>
+    </w:p>
+    <w:p>
+      <w:pPr>
+        <w:ind w:left="708"/>
+        <w:rPr>
+          <w:i/>
+          <w:iCs/>
+        </w:rPr>
+      </w:pPr>
+      <w:proofErr w:type="spellStart"/>
+      <w:r>
+        <w:rPr>
+          <w:i/>
+          <w:iCs/>
+        </w:rPr>
+        <w:t>cd</w:t>
+      </w:r>
+      <w:proofErr w:type="spellEnd"/>
+      <w:r>
+        <w:rPr>
+          <w:i/>
+          <w:iCs/>
+        </w:rPr>
+        <w:t xml:space="preserve"> /</w:t>
+      </w:r>
+      <w:proofErr w:type="spellStart"/>
+      <w:r>
+        <w:rPr>
+          <w:i/>
+          <w:iCs/>
+        </w:rPr>
+        <w:t>srv</w:t>
+      </w:r>
+      <w:proofErr w:type="spellEnd"/>
+      <w:r>
+        <w:rPr>
+          <w:i/>
+          <w:iCs/>
+        </w:rPr>
+        <w:t>/</w:t>
+      </w:r>
+      <w:proofErr w:type="spellStart"/>
+      <w:r>
+        <w:rPr>
+          <w:i/>
+          <w:iCs/>
+        </w:rPr>
+        <w:t>minhacnhonline</w:t>
+      </w:r>
+      <w:proofErr w:type="spellEnd"/>
+      <w:r>
+        <w:rPr>
+          <w:i/>
+          <w:iCs/>
+        </w:rPr>
+        <w:t xml:space="preserve">/app || </w:t>
+      </w:r>
+      <w:proofErr w:type="spellStart"/>
+      <w:r>
+        <w:rPr>
+          <w:i/>
+          <w:iCs/>
+        </w:rPr>
+        <w:t>exit</w:t>
+      </w:r>
+      <w:proofErr w:type="spellEnd"/>
+      <w:r>
+        <w:rPr>
+          <w:i/>
+          <w:iCs/>
+        </w:rPr>
+        <w:t xml:space="preserve"> 1</w:t>
+      </w:r>
+    </w:p>
+    <w:p>
+      <w:pPr>
+        <w:ind w:left="708"/>
+        <w:rPr>
+          <w:i/>
+          <w:iCs/>
+        </w:rPr>
+      </w:pPr>
+      <w:r>
+        <w:rPr>
+          <w:i/>
+          <w:iCs/>
+        </w:rPr>
+        <w:t>/</w:t>
+      </w:r>
+      <w:proofErr w:type="spellStart"/>
+      <w:r>
+        <w:rPr>
+          <w:i/>
+          <w:iCs/>
+        </w:rPr>
+        <w:t>srv</w:t>
+      </w:r>
+      <w:proofErr w:type="spellEnd"/>
+      <w:r>
+        <w:rPr>
+          <w:i/>
+          <w:iCs/>
+        </w:rPr>
+        <w:t>/</w:t>
+      </w:r>
+      <w:proofErr w:type="spellStart"/>
+      <w:r>
+        <w:rPr>
+          <w:i/>
+          <w:iCs/>
+        </w:rPr>
+        <w:t>minhacnhonline</w:t>
+      </w:r>
+      <w:proofErr w:type="spellEnd"/>
+      <w:r>
+        <w:rPr>
+          <w:i/>
+          <w:iCs/>
+        </w:rPr>
+        <w:t>/</w:t>
+      </w:r>
+      <w:proofErr w:type="spellStart"/>
+      <w:r>
+        <w:rPr>
+          <w:i/>
+          <w:iCs/>
+        </w:rPr>
+        <w:t>venv</w:t>
+      </w:r>
+      <w:proofErr w:type="spellEnd"/>
+      <w:r>
+        <w:rPr>
+          <w:i/>
+          <w:iCs/>
+        </w:rPr>
+        <w:t>/bin/</w:t>
+      </w:r>
+      <w:proofErr w:type="spellStart"/>
+      <w:r>
+        <w:rPr>
+          <w:i/>
+          <w:iCs/>
+        </w:rPr>
+        <w:t>gunicorn</w:t>
+      </w:r>
+      <w:proofErr w:type="spellEnd"/>
+      <w:r>
+        <w:rPr>
+          <w:i/>
+          <w:iCs/>
+        </w:rPr>
+        <w:t xml:space="preserve"> </w:t>
+      </w:r>
+      <w:proofErr w:type="spellStart"/>
+      <w:proofErr w:type="gramStart"/>
+      <w:r>
+        <w:rPr>
+          <w:i/>
+          <w:iCs/>
+        </w:rPr>
+        <w:t>core.asgi</w:t>
+      </w:r>
+      <w:proofErr w:type="gramEnd"/>
+      <w:r>
+        <w:rPr>
+          <w:i/>
+          <w:iCs/>
+        </w:rPr>
+        <w:t>:application</w:t>
+      </w:r>
+      <w:proofErr w:type="spellEnd"/>
+      <w:r>
+        <w:rPr>
+          <w:i/>
+          <w:iCs/>
+        </w:rPr>
+        <w:t xml:space="preserve"> \</w:t>
+      </w:r>
+    </w:p>
+    <w:p>
+      <w:pPr>
+        <w:ind w:left="708"/>
+        <w:rPr>
+          <w:i/>
+          <w:iCs/>
+        </w:rPr>
+      </w:pPr>
+      <w:r>
+        <w:rPr>
+          <w:i/>
+          <w:iCs/>
+        </w:rPr>
+        <w:t xml:space="preserve">  -</w:t>
+      </w:r>
+      <w:proofErr w:type="gramStart"/>
+      <w:r>
+        <w:rPr>
+          <w:i/>
+          <w:iCs/>
+        </w:rPr>
+        <w:t>k</w:t>
+      </w:r>
+      <w:proofErr w:type="gramEnd"/>
+      <w:r>
+        <w:rPr>
+          <w:i/>
+          <w:iCs/>
+        </w:rPr>
+        <w:t xml:space="preserve"> </w:t>
+      </w:r>
+      <w:proofErr w:type="spellStart"/>
+      <w:proofErr w:type="gramStart"/>
+      <w:r>
+        <w:rPr>
+          <w:i/>
+          <w:iCs/>
+        </w:rPr>
+        <w:t>uvicorn.workers</w:t>
+      </w:r>
+      <w:proofErr w:type="gramEnd"/>
+      <w:r>
+        <w:rPr>
+          <w:i/>
+          <w:iCs/>
+        </w:rPr>
+        <w:t>.UvicornWorker</w:t>
+      </w:r>
+      <w:proofErr w:type="spellEnd"/>
+      <w:r>
+        <w:rPr>
+          <w:i/>
+          <w:iCs/>
+        </w:rPr>
+        <w:t xml:space="preserve"> \</w:t>
+      </w:r>
+    </w:p>
+    <w:p>
+      <w:pPr>
+        <w:ind w:left="708"/>
+      </w:pPr>
+      <w:r>
+        <w:rPr>
+          <w:i/>
+          <w:iCs/>
+        </w:rPr>
+        <w:t xml:space="preserve">  --</w:t>
+      </w:r>
+      <w:proofErr w:type="spellStart"/>
+      <w:r>
+        <w:rPr>
+          <w:i/>
+          <w:iCs/>
+        </w:rPr>
+        <w:t>bind</w:t>
+      </w:r>
+      <w:proofErr w:type="spellEnd"/>
+      <w:r>
+        <w:rPr>
+          <w:i/>
+          <w:iCs/>
+        </w:rPr>
+        <w:t xml:space="preserve"> 127.0.0.1:9000 --</w:t>
+      </w:r>
+      <w:proofErr w:type="spellStart"/>
+      <w:r>
+        <w:rPr>
+          <w:i/>
+          <w:iCs/>
+        </w:rPr>
+        <w:t>workers</w:t>
+      </w:r>
+      <w:proofErr w:type="spellEnd"/>
+      <w:r>
+        <w:rPr>
+          <w:i/>
+          <w:iCs/>
+        </w:rPr>
+        <w:t xml:space="preserve"> 1 --timeout 60</w:t>
+      </w:r>
+      <w:r>
+        <w:t>'</w:t>
+      </w:r>
+    </w:p>
+    <w:p>
+      <w:pPr>
+        <w:rPr>
+          <w:b/>
+          <w:bCs/>
+          <w:i/>
+          <w:iCs/>
+          <w:color w:val="C00000"/>
+        </w:rPr>
+      </w:pPr>
+      <w:r>
+        <w:rPr>
+          <w:b/>
+          <w:bCs/>
+          <w:i/>
+          <w:iCs/>
+          <w:color w:val="C00000"/>
+        </w:rPr>
+        <w:lastRenderedPageBreak/>
+        <w:t xml:space="preserve">16. </w:t>
+      </w:r>
+      <w:r>
+        <w:rPr>
+          <w:b/>
+          <w:bCs/>
+          <w:i/>
+          <w:iCs/>
+          <w:color w:val="C00000"/>
+        </w:rPr>
+        <w:t xml:space="preserve">Dando tudo certo </w:t>
+      </w:r>
+      <w:r>
+        <w:rPr>
+          <w:b/>
+          <w:bCs/>
+          <w:i/>
+          <w:iCs/>
+          <w:color w:val="C00000"/>
+        </w:rPr>
+        <w:t xml:space="preserve">vamos ligar isso tudo pelo </w:t>
+      </w:r>
+      <w:proofErr w:type="spellStart"/>
+      <w:r>
+        <w:rPr>
+          <w:b/>
+          <w:bCs/>
+          <w:i/>
+          <w:iCs/>
+          <w:color w:val="C00000"/>
+        </w:rPr>
+        <w:t>systemd</w:t>
+      </w:r>
+      <w:proofErr w:type="spellEnd"/>
+      <w:r>
+        <w:rPr>
+          <w:b/>
+          <w:bCs/>
+          <w:i/>
+          <w:iCs/>
+          <w:color w:val="C00000"/>
+        </w:rPr>
+        <w:t xml:space="preserve"> + NGINX</w:t>
+      </w:r>
+      <w:r>
+        <w:rPr>
+          <w:b/>
+          <w:bCs/>
+          <w:i/>
+          <w:iCs/>
+          <w:color w:val="C00000"/>
+        </w:rPr>
+        <w:t>:</w:t>
+      </w:r>
+    </w:p>
+    <w:p>
+      <w:pPr>
+        <w:rPr>
+          <w:b/>
+          <w:bCs/>
+        </w:rPr>
+      </w:pPr>
+      <w:r>
+        <w:rPr>
+          <w:b/>
+          <w:bCs/>
+        </w:rPr>
+        <w:t>1) Pare o teste manual (se ainda estiver rodando)</w:t>
+      </w:r>
+    </w:p>
+    <w:p>
+      <w:r>
+        <w:t xml:space="preserve">Se o comando do </w:t>
+      </w:r>
+      <w:proofErr w:type="spellStart"/>
+      <w:r>
+        <w:t>Gunicorn</w:t>
+      </w:r>
+      <w:proofErr w:type="spellEnd"/>
+      <w:r>
+        <w:t xml:space="preserve"> ainda está em primeiro plano, finalize com </w:t>
+      </w:r>
+      <w:proofErr w:type="spellStart"/>
+      <w:r>
+        <w:t>Ctrl+C</w:t>
+      </w:r>
+      <w:proofErr w:type="spellEnd"/>
+      <w:r>
+        <w:t>.</w:t>
+      </w:r>
+    </w:p>
+    <w:p>
+      <w:pPr>
+        <w:rPr>
+          <w:b/>
+          <w:bCs/>
+        </w:rPr>
+      </w:pPr>
+      <w:r>
+        <w:rPr>
+          <w:b/>
+          <w:bCs/>
+        </w:rPr>
+        <w:t xml:space="preserve">2) Confira o </w:t>
+      </w:r>
+      <w:proofErr w:type="spellStart"/>
+      <w:r>
+        <w:rPr>
+          <w:b/>
+          <w:bCs/>
+        </w:rPr>
+        <w:t>unit</w:t>
+      </w:r>
+      <w:proofErr w:type="spellEnd"/>
+      <w:r>
+        <w:rPr>
+          <w:b/>
+          <w:bCs/>
+        </w:rPr>
+        <w:t xml:space="preserve"> file do </w:t>
+      </w:r>
+      <w:proofErr w:type="spellStart"/>
+      <w:r>
+        <w:rPr>
+          <w:b/>
+          <w:bCs/>
+        </w:rPr>
+        <w:t>systemd</w:t>
+      </w:r>
+      <w:proofErr w:type="spellEnd"/>
+    </w:p>
+    <w:p>
+      <w:r>
+        <w:t>Abra e valide estes pontos em /</w:t>
+      </w:r>
+      <w:proofErr w:type="spellStart"/>
+      <w:r>
+        <w:t>etc</w:t>
+      </w:r>
+      <w:proofErr w:type="spellEnd"/>
+      <w:r>
+        <w:t>/</w:t>
+      </w:r>
+      <w:proofErr w:type="spellStart"/>
+      <w:r>
+        <w:t>systemd</w:t>
+      </w:r>
+      <w:proofErr w:type="spellEnd"/>
+      <w:r>
+        <w:t>/system/</w:t>
+      </w:r>
+      <w:proofErr w:type="spellStart"/>
+      <w:r>
+        <w:t>minhacnhonline.service</w:t>
+      </w:r>
+      <w:proofErr w:type="spellEnd"/>
+      <w:r>
+        <w:t>:</w:t>
+      </w:r>
+    </w:p>
+    <w:p>
+      <w:pPr>
+        <w:ind w:firstLine="708"/>
+        <w:rPr>
+          <w:i/>
+          <w:iCs/>
+        </w:rPr>
+      </w:pPr>
+      <w:proofErr w:type="spellStart"/>
+      <w:r>
+        <w:rPr>
+          <w:i/>
+          <w:iCs/>
+        </w:rPr>
+        <w:t>sudo</w:t>
+      </w:r>
+      <w:proofErr w:type="spellEnd"/>
+      <w:r>
+        <w:rPr>
+          <w:i/>
+          <w:iCs/>
+        </w:rPr>
+        <w:t xml:space="preserve"> nano </w:t>
+      </w:r>
+      <w:r>
+        <w:rPr>
+          <w:i/>
+          <w:iCs/>
+        </w:rPr>
+        <w:t>/</w:t>
+      </w:r>
+      <w:proofErr w:type="spellStart"/>
+      <w:r>
+        <w:rPr>
+          <w:i/>
+          <w:iCs/>
+        </w:rPr>
+        <w:t>etc</w:t>
+      </w:r>
+      <w:proofErr w:type="spellEnd"/>
+      <w:r>
+        <w:rPr>
+          <w:i/>
+          <w:iCs/>
+        </w:rPr>
+        <w:t>/</w:t>
+      </w:r>
+      <w:proofErr w:type="spellStart"/>
+      <w:r>
+        <w:rPr>
+          <w:i/>
+          <w:iCs/>
+        </w:rPr>
+        <w:t>systemd</w:t>
+      </w:r>
+      <w:proofErr w:type="spellEnd"/>
+      <w:r>
+        <w:rPr>
+          <w:i/>
+          <w:iCs/>
+        </w:rPr>
+        <w:t>/system/</w:t>
+      </w:r>
+      <w:proofErr w:type="spellStart"/>
+      <w:r>
+        <w:rPr>
+          <w:i/>
+          <w:iCs/>
+        </w:rPr>
+        <w:t>minhacnhonline.service</w:t>
+      </w:r>
+      <w:proofErr w:type="spellEnd"/>
+    </w:p>
+    <w:p/>
+    <w:p>
+      <w:r>
+        <w:t>Este deve ser o conteúdo:</w:t>
+      </w:r>
+    </w:p>
+    <w:p>
+      <w:pPr>
+        <w:ind w:left="708"/>
+        <w:rPr>
+          <w:i/>
+          <w:iCs/>
+        </w:rPr>
+      </w:pPr>
+      <w:r>
+        <w:rPr>
+          <w:i/>
+          <w:iCs/>
+        </w:rPr>
+        <w:t>[Unit]</w:t>
+      </w:r>
+    </w:p>
+    <w:p>
+      <w:pPr>
+        <w:ind w:left="708"/>
+        <w:rPr>
+          <w:i/>
+          <w:iCs/>
+        </w:rPr>
+      </w:pPr>
+      <w:proofErr w:type="spellStart"/>
+      <w:r>
+        <w:rPr>
+          <w:i/>
+          <w:iCs/>
+        </w:rPr>
+        <w:t>Description</w:t>
+      </w:r>
+      <w:proofErr w:type="spellEnd"/>
+      <w:r>
+        <w:rPr>
+          <w:i/>
+          <w:iCs/>
+        </w:rPr>
+        <w:t>=</w:t>
+      </w:r>
+      <w:proofErr w:type="spellStart"/>
+      <w:r>
+        <w:rPr>
+          <w:i/>
+          <w:iCs/>
+        </w:rPr>
+        <w:t>Gunicorn</w:t>
+      </w:r>
+      <w:proofErr w:type="spellEnd"/>
+      <w:r>
+        <w:rPr>
+          <w:i/>
+          <w:iCs/>
+        </w:rPr>
+        <w:t xml:space="preserve"> </w:t>
+      </w:r>
+      <w:proofErr w:type="spellStart"/>
+      <w:r>
+        <w:rPr>
+          <w:i/>
+          <w:iCs/>
+        </w:rPr>
+        <w:t>service</w:t>
+      </w:r>
+      <w:proofErr w:type="spellEnd"/>
+      <w:r>
+        <w:rPr>
+          <w:i/>
+          <w:iCs/>
+        </w:rPr>
+        <w:t xml:space="preserve"> for </w:t>
+      </w:r>
+      <w:proofErr w:type="spellStart"/>
+      <w:r>
+        <w:rPr>
+          <w:i/>
+          <w:iCs/>
+        </w:rPr>
+        <w:t>minhacnhonline</w:t>
+      </w:r>
+      <w:proofErr w:type="spellEnd"/>
+    </w:p>
+    <w:p>
+      <w:pPr>
+        <w:ind w:left="708"/>
+        <w:rPr>
+          <w:i/>
+          <w:iCs/>
+        </w:rPr>
+      </w:pPr>
+      <w:proofErr w:type="spellStart"/>
+      <w:r>
+        <w:rPr>
+          <w:i/>
+          <w:iCs/>
+        </w:rPr>
+        <w:t>After</w:t>
+      </w:r>
+      <w:proofErr w:type="spellEnd"/>
+      <w:r>
+        <w:rPr>
+          <w:i/>
+          <w:iCs/>
+        </w:rPr>
+        <w:t>=</w:t>
+      </w:r>
+      <w:proofErr w:type="spellStart"/>
+      <w:r>
+        <w:rPr>
+          <w:i/>
+          <w:iCs/>
+        </w:rPr>
+        <w:t>network.target</w:t>
+      </w:r>
+      <w:proofErr w:type="spellEnd"/>
+    </w:p>
+    <w:p>
+      <w:pPr>
+        <w:ind w:left="708"/>
+        <w:rPr>
+          <w:i/>
+          <w:iCs/>
+        </w:rPr>
+      </w:pPr>
+    </w:p>
+    <w:p>
+      <w:pPr>
+        <w:ind w:left="708"/>
+        <w:rPr>
+          <w:i/>
+          <w:iCs/>
+        </w:rPr>
+      </w:pPr>
+      <w:r>
+        <w:rPr>
+          <w:i/>
+          <w:iCs/>
+        </w:rPr>
+        <w:t>[Service]</w:t>
+      </w:r>
+    </w:p>
+    <w:p>
+      <w:pPr>
+        <w:ind w:left="708"/>
+        <w:rPr>
+          <w:i/>
+          <w:iCs/>
+        </w:rPr>
+      </w:pPr>
+      <w:r>
+        <w:rPr>
+          <w:i/>
+          <w:iCs/>
+        </w:rPr>
+        <w:t>User=multimidia</w:t>
+      </w:r>
+    </w:p>
+    <w:p>
+      <w:pPr>
+        <w:ind w:left="708"/>
+        <w:rPr>
+          <w:i/>
+          <w:iCs/>
+        </w:rPr>
+      </w:pPr>
+      <w:proofErr w:type="spellStart"/>
+      <w:r>
+        <w:rPr>
+          <w:i/>
+          <w:iCs/>
+        </w:rPr>
+        <w:t>Group</w:t>
+      </w:r>
+      <w:proofErr w:type="spellEnd"/>
+      <w:r>
+        <w:rPr>
+          <w:i/>
+          <w:iCs/>
+        </w:rPr>
+        <w:t>=multimidia</w:t>
+      </w:r>
+    </w:p>
+    <w:p>
+      <w:pPr>
+        <w:ind w:left="708"/>
+        <w:rPr>
+          <w:i/>
+          <w:iCs/>
+        </w:rPr>
+      </w:pPr>
+      <w:proofErr w:type="spellStart"/>
+      <w:r>
+        <w:rPr>
+          <w:i/>
+          <w:iCs/>
+        </w:rPr>
+        <w:t>WorkingDirectory</w:t>
+      </w:r>
+      <w:proofErr w:type="spellEnd"/>
+      <w:r>
+        <w:rPr>
+          <w:i/>
+          <w:iCs/>
+        </w:rPr>
+        <w:t>=/</w:t>
+      </w:r>
+      <w:proofErr w:type="spellStart"/>
+      <w:r>
+        <w:rPr>
+          <w:i/>
+          <w:iCs/>
+        </w:rPr>
+        <w:t>srv</w:t>
+      </w:r>
+      <w:proofErr w:type="spellEnd"/>
+      <w:r>
+        <w:rPr>
+          <w:i/>
+          <w:iCs/>
+        </w:rPr>
+        <w:t>/</w:t>
+      </w:r>
+      <w:proofErr w:type="spellStart"/>
+      <w:r>
+        <w:rPr>
+          <w:i/>
+          <w:iCs/>
+        </w:rPr>
+        <w:t>minhacnhonline</w:t>
+      </w:r>
+      <w:proofErr w:type="spellEnd"/>
+      <w:r>
+        <w:rPr>
+          <w:i/>
+          <w:iCs/>
+        </w:rPr>
+        <w:t>/app</w:t>
+      </w:r>
+    </w:p>
+    <w:p>
+      <w:pPr>
+        <w:ind w:left="708"/>
+        <w:rPr>
+          <w:i/>
+          <w:iCs/>
+        </w:rPr>
+      </w:pPr>
+      <w:proofErr w:type="spellStart"/>
+      <w:r>
+        <w:rPr>
+          <w:i/>
+          <w:iCs/>
+        </w:rPr>
+        <w:t>EnvironmentFile</w:t>
+      </w:r>
+      <w:proofErr w:type="spellEnd"/>
+      <w:r>
+        <w:rPr>
+          <w:i/>
+          <w:iCs/>
+        </w:rPr>
+        <w:t>=/</w:t>
+      </w:r>
+      <w:proofErr w:type="spellStart"/>
+      <w:r>
+        <w:rPr>
+          <w:i/>
+          <w:iCs/>
+        </w:rPr>
+        <w:t>srv</w:t>
+      </w:r>
+      <w:proofErr w:type="spellEnd"/>
+      <w:r>
+        <w:rPr>
+          <w:i/>
+          <w:iCs/>
+        </w:rPr>
+        <w:t>/</w:t>
+      </w:r>
+      <w:proofErr w:type="spellStart"/>
+      <w:r>
+        <w:rPr>
+          <w:i/>
+          <w:iCs/>
+        </w:rPr>
+        <w:t>minhacnhonline</w:t>
+      </w:r>
+      <w:proofErr w:type="spellEnd"/>
+      <w:r>
+        <w:rPr>
+          <w:i/>
+          <w:iCs/>
+        </w:rPr>
+        <w:t>/app</w:t>
+      </w:r>
+      <w:proofErr w:type="gramStart"/>
+      <w:r>
+        <w:rPr>
+          <w:i/>
+          <w:iCs/>
+        </w:rPr>
+        <w:t>/.</w:t>
+      </w:r>
+      <w:proofErr w:type="spellStart"/>
+      <w:r>
+        <w:rPr>
+          <w:i/>
+          <w:iCs/>
+        </w:rPr>
+        <w:t>env</w:t>
+      </w:r>
+      <w:proofErr w:type="spellEnd"/>
+      <w:proofErr w:type="gramEnd"/>
+    </w:p>
+    <w:p>
+      <w:pPr>
+        <w:ind w:left="708"/>
+        <w:rPr>
+          <w:i/>
+          <w:iCs/>
+        </w:rPr>
+      </w:pPr>
+      <w:proofErr w:type="spellStart"/>
+      <w:r>
+        <w:rPr>
+          <w:i/>
+          <w:iCs/>
+        </w:rPr>
+        <w:t>ExecStart</w:t>
+      </w:r>
+      <w:proofErr w:type="spellEnd"/>
+      <w:r>
+        <w:rPr>
+          <w:i/>
+          <w:iCs/>
+        </w:rPr>
+        <w:t>=/</w:t>
+      </w:r>
+      <w:proofErr w:type="spellStart"/>
+      <w:r>
+        <w:rPr>
+          <w:i/>
+          <w:iCs/>
+        </w:rPr>
+        <w:t>srv</w:t>
+      </w:r>
+      <w:proofErr w:type="spellEnd"/>
+      <w:r>
+        <w:rPr>
+          <w:i/>
+          <w:iCs/>
+        </w:rPr>
+        <w:t>/</w:t>
+      </w:r>
+      <w:proofErr w:type="spellStart"/>
+      <w:r>
+        <w:rPr>
+          <w:i/>
+          <w:iCs/>
+        </w:rPr>
+        <w:t>minhacnhonline</w:t>
+      </w:r>
+      <w:proofErr w:type="spellEnd"/>
+      <w:r>
+        <w:rPr>
+          <w:i/>
+          <w:iCs/>
+        </w:rPr>
+        <w:t>/</w:t>
+      </w:r>
+      <w:proofErr w:type="spellStart"/>
+      <w:r>
+        <w:rPr>
+          <w:i/>
+          <w:iCs/>
+        </w:rPr>
+        <w:t>venv</w:t>
+      </w:r>
+      <w:proofErr w:type="spellEnd"/>
+      <w:r>
+        <w:rPr>
+          <w:i/>
+          <w:iCs/>
+        </w:rPr>
+        <w:t>/bin/</w:t>
+      </w:r>
+      <w:proofErr w:type="spellStart"/>
+      <w:r>
+        <w:rPr>
+          <w:i/>
+          <w:iCs/>
+        </w:rPr>
+        <w:t>gunicorn</w:t>
+      </w:r>
+      <w:proofErr w:type="spellEnd"/>
+      <w:r>
+        <w:rPr>
+          <w:i/>
+          <w:iCs/>
+        </w:rPr>
+        <w:t xml:space="preserve"> </w:t>
+      </w:r>
+      <w:proofErr w:type="spellStart"/>
+      <w:proofErr w:type="gramStart"/>
+      <w:r>
+        <w:rPr>
+          <w:i/>
+          <w:iCs/>
+        </w:rPr>
+        <w:t>core.asgi</w:t>
+      </w:r>
+      <w:proofErr w:type="gramEnd"/>
+      <w:r>
+        <w:rPr>
+          <w:i/>
+          <w:iCs/>
+        </w:rPr>
+        <w:t>:application</w:t>
+      </w:r>
+      <w:proofErr w:type="spellEnd"/>
+      <w:r>
+        <w:rPr>
+          <w:i/>
+          <w:iCs/>
+        </w:rPr>
+        <w:t xml:space="preserve"> \</w:t>
+      </w:r>
+    </w:p>
+    <w:p>
+      <w:pPr>
+        <w:ind w:left="708"/>
+        <w:rPr>
+          <w:i/>
+          <w:iCs/>
+        </w:rPr>
+      </w:pPr>
+      <w:r>
+        <w:rPr>
+          <w:i/>
+          <w:iCs/>
+        </w:rPr>
+        <w:t xml:space="preserve">  -</w:t>
+      </w:r>
+      <w:proofErr w:type="gramStart"/>
+      <w:r>
+        <w:rPr>
+          <w:i/>
+          <w:iCs/>
+        </w:rPr>
+        <w:t>k</w:t>
+      </w:r>
+      <w:proofErr w:type="gramEnd"/>
+      <w:r>
+        <w:rPr>
+          <w:i/>
+          <w:iCs/>
+        </w:rPr>
+        <w:t xml:space="preserve"> </w:t>
+      </w:r>
+      <w:proofErr w:type="spellStart"/>
+      <w:proofErr w:type="gramStart"/>
+      <w:r>
+        <w:rPr>
+          <w:i/>
+          <w:iCs/>
+        </w:rPr>
+        <w:t>uvicorn.workers</w:t>
+      </w:r>
+      <w:proofErr w:type="gramEnd"/>
+      <w:r>
+        <w:rPr>
+          <w:i/>
+          <w:iCs/>
+        </w:rPr>
+        <w:t>.UvicornWorker</w:t>
+      </w:r>
+      <w:proofErr w:type="spellEnd"/>
+      <w:r>
+        <w:rPr>
+          <w:i/>
+          <w:iCs/>
+        </w:rPr>
+        <w:t xml:space="preserve"> \</w:t>
+      </w:r>
+    </w:p>
+    <w:p>
+      <w:pPr>
+        <w:ind w:left="708"/>
+        <w:rPr>
+          <w:i/>
+          <w:iCs/>
+        </w:rPr>
+      </w:pPr>
+      <w:r>
+        <w:rPr>
+          <w:i/>
+          <w:iCs/>
+        </w:rPr>
+        <w:t xml:space="preserve">  --</w:t>
+      </w:r>
+      <w:proofErr w:type="spellStart"/>
+      <w:r>
+        <w:rPr>
+          <w:i/>
+          <w:iCs/>
+        </w:rPr>
+        <w:t>workers</w:t>
+      </w:r>
+      <w:proofErr w:type="spellEnd"/>
+      <w:r>
+        <w:rPr>
+          <w:i/>
+          <w:iCs/>
+        </w:rPr>
+        <w:t xml:space="preserve"> 3 --timeout 60 \</w:t>
+      </w:r>
+    </w:p>
+    <w:p>
+      <w:pPr>
+        <w:ind w:left="708"/>
+        <w:rPr>
+          <w:i/>
+          <w:iCs/>
+        </w:rPr>
+      </w:pPr>
+      <w:r>
+        <w:rPr>
+          <w:i/>
+          <w:iCs/>
+        </w:rPr>
+        <w:t xml:space="preserve">  --</w:t>
+      </w:r>
+      <w:proofErr w:type="spellStart"/>
+      <w:r>
+        <w:rPr>
+          <w:i/>
+          <w:iCs/>
+        </w:rPr>
+        <w:t>bind</w:t>
+      </w:r>
+      <w:proofErr w:type="spellEnd"/>
+      <w:r>
+        <w:rPr>
+          <w:i/>
+          <w:iCs/>
+        </w:rPr>
+        <w:t xml:space="preserve"> </w:t>
+      </w:r>
+      <w:proofErr w:type="spellStart"/>
+      <w:r>
+        <w:rPr>
+          <w:i/>
+          <w:iCs/>
+        </w:rPr>
+        <w:t>unix</w:t>
+      </w:r>
+      <w:proofErr w:type="spellEnd"/>
+      <w:r>
+        <w:rPr>
+          <w:i/>
+          <w:iCs/>
+        </w:rPr>
+        <w:t>:/</w:t>
+      </w:r>
+      <w:proofErr w:type="spellStart"/>
+      <w:r>
+        <w:rPr>
+          <w:i/>
+          <w:iCs/>
+        </w:rPr>
+        <w:t>srv</w:t>
+      </w:r>
+      <w:proofErr w:type="spellEnd"/>
+      <w:r>
+        <w:rPr>
+          <w:i/>
+          <w:iCs/>
+        </w:rPr>
+        <w:t>/</w:t>
+      </w:r>
+      <w:proofErr w:type="spellStart"/>
+      <w:r>
+        <w:rPr>
+          <w:i/>
+          <w:iCs/>
+        </w:rPr>
+        <w:t>minhacnhonline</w:t>
+      </w:r>
+      <w:proofErr w:type="spellEnd"/>
+      <w:r>
+        <w:rPr>
+          <w:i/>
+          <w:iCs/>
+        </w:rPr>
+        <w:t>/</w:t>
+      </w:r>
+      <w:proofErr w:type="spellStart"/>
+      <w:r>
+        <w:rPr>
+          <w:i/>
+          <w:iCs/>
+        </w:rPr>
+        <w:t>run</w:t>
+      </w:r>
+      <w:proofErr w:type="spellEnd"/>
+      <w:r>
+        <w:rPr>
+          <w:i/>
+          <w:iCs/>
+        </w:rPr>
+        <w:t>/</w:t>
+      </w:r>
+      <w:proofErr w:type="spellStart"/>
+      <w:r>
+        <w:rPr>
+          <w:i/>
+          <w:iCs/>
+        </w:rPr>
+        <w:t>gunicorn.sock</w:t>
+      </w:r>
+      <w:proofErr w:type="spellEnd"/>
+    </w:p>
+    <w:p>
+      <w:pPr>
+        <w:ind w:left="708"/>
+        <w:rPr>
+          <w:i/>
+          <w:iCs/>
+        </w:rPr>
+      </w:pPr>
+      <w:proofErr w:type="spellStart"/>
+      <w:r>
+        <w:rPr>
+          <w:i/>
+          <w:iCs/>
+        </w:rPr>
+        <w:t>Restart</w:t>
+      </w:r>
+      <w:proofErr w:type="spellEnd"/>
+      <w:r>
+        <w:rPr>
+          <w:i/>
+          <w:iCs/>
+        </w:rPr>
+        <w:t>=</w:t>
+      </w:r>
+      <w:proofErr w:type="spellStart"/>
+      <w:r>
+        <w:rPr>
+          <w:i/>
+          <w:iCs/>
+        </w:rPr>
+        <w:t>on-failure</w:t>
+      </w:r>
+      <w:proofErr w:type="spellEnd"/>
+    </w:p>
+    <w:p>
+      <w:pPr>
+        <w:ind w:left="708"/>
+        <w:rPr>
+          <w:i/>
+          <w:iCs/>
+        </w:rPr>
+      </w:pPr>
+      <w:proofErr w:type="spellStart"/>
+      <w:r>
+        <w:rPr>
+          <w:i/>
+          <w:iCs/>
+        </w:rPr>
+        <w:t>Environment</w:t>
+      </w:r>
+      <w:proofErr w:type="spellEnd"/>
+      <w:r>
+        <w:rPr>
+          <w:i/>
+          <w:iCs/>
+        </w:rPr>
+        <w:t>=PYTHONUNBUFFERED=1</w:t>
+      </w:r>
+    </w:p>
+    <w:p>
+      <w:pPr>
+        <w:ind w:left="708"/>
+        <w:rPr>
+          <w:i/>
+          <w:iCs/>
+        </w:rPr>
+      </w:pPr>
+      <w:proofErr w:type="spellStart"/>
+      <w:r>
+        <w:rPr>
+          <w:i/>
+          <w:iCs/>
+        </w:rPr>
+        <w:t>StandardOutput</w:t>
+      </w:r>
+      <w:proofErr w:type="spellEnd"/>
+      <w:r>
+        <w:rPr>
+          <w:i/>
+          <w:iCs/>
+        </w:rPr>
+        <w:t>=</w:t>
+      </w:r>
+      <w:proofErr w:type="spellStart"/>
+      <w:r>
+        <w:rPr>
+          <w:i/>
+          <w:iCs/>
+        </w:rPr>
+        <w:t>journal</w:t>
+      </w:r>
+      <w:proofErr w:type="spellEnd"/>
+    </w:p>
+    <w:p>
+      <w:pPr>
+        <w:ind w:left="708"/>
+        <w:rPr>
+          <w:i/>
+          <w:iCs/>
+        </w:rPr>
+      </w:pPr>
+      <w:proofErr w:type="spellStart"/>
+      <w:r>
+        <w:rPr>
+          <w:i/>
+          <w:iCs/>
+        </w:rPr>
+        <w:t>StandardError</w:t>
+      </w:r>
+      <w:proofErr w:type="spellEnd"/>
+      <w:r>
+        <w:rPr>
+          <w:i/>
+          <w:iCs/>
+        </w:rPr>
+        <w:t>=</w:t>
+      </w:r>
+      <w:proofErr w:type="spellStart"/>
+      <w:r>
+        <w:rPr>
+          <w:i/>
+          <w:iCs/>
+        </w:rPr>
+        <w:t>journal</w:t>
+      </w:r>
+      <w:proofErr w:type="spellEnd"/>
+    </w:p>
+    <w:p>
+      <w:pPr>
+        <w:ind w:left="708"/>
+        <w:rPr>
+          <w:i/>
+          <w:iCs/>
+        </w:rPr>
+      </w:pPr>
+    </w:p>
+    <w:p>
+      <w:pPr>
+        <w:ind w:left="708"/>
+        <w:rPr>
+          <w:i/>
+          <w:iCs/>
+        </w:rPr>
+      </w:pPr>
+      <w:r>
+        <w:rPr>
+          <w:i/>
+          <w:iCs/>
+        </w:rPr>
+        <w:t>[</w:t>
+      </w:r>
+      <w:proofErr w:type="spellStart"/>
+      <w:r>
+        <w:rPr>
+          <w:i/>
+          <w:iCs/>
+        </w:rPr>
+        <w:t>Install</w:t>
+      </w:r>
+      <w:proofErr w:type="spellEnd"/>
+      <w:r>
+        <w:rPr>
+          <w:i/>
+          <w:iCs/>
+        </w:rPr>
+        <w:t>]</w:t>
+      </w:r>
+    </w:p>
+    <w:p>
+      <w:pPr>
+        <w:ind w:left="708"/>
+        <w:rPr>
+          <w:i/>
+          <w:iCs/>
+        </w:rPr>
+      </w:pPr>
+      <w:proofErr w:type="spellStart"/>
+      <w:r>
+        <w:rPr>
+          <w:i/>
+          <w:iCs/>
+        </w:rPr>
+        <w:t>WantedBy</w:t>
+      </w:r>
+      <w:proofErr w:type="spellEnd"/>
+      <w:r>
+        <w:rPr>
+          <w:i/>
+          <w:iCs/>
+        </w:rPr>
+        <w:t>=</w:t>
+      </w:r>
+      <w:proofErr w:type="spellStart"/>
+      <w:r>
+        <w:rPr>
+          <w:i/>
+          <w:iCs/>
+        </w:rPr>
+        <w:t>multi-</w:t>
+      </w:r>
+      <w:proofErr w:type="gramStart"/>
+      <w:r>
+        <w:rPr>
+          <w:i/>
+          <w:iCs/>
+        </w:rPr>
+        <w:t>user.target</w:t>
+      </w:r>
+      <w:proofErr w:type="spellEnd"/>
+      <w:proofErr w:type="gramEnd"/>
+    </w:p>
+    <w:p>
+      <w:pPr>
+        <w:ind w:left="708"/>
+        <w:rPr>
+          <w:b/>
+          <w:bCs/>
+        </w:rPr>
+      </w:pPr>
+      <w:r>
+        <w:rPr>
+          <w:b/>
+          <w:bCs/>
+        </w:rPr>
+        <w:lastRenderedPageBreak/>
+        <w:t xml:space="preserve">3) </w:t>
+      </w:r>
+      <w:r>
+        <w:rPr>
+          <w:b/>
+          <w:bCs/>
+        </w:rPr>
+        <w:t>Garanta que o diretório do socket existe e tem permissão para o grupo:</w:t>
+      </w:r>
+    </w:p>
+    <w:p>
+      <w:pPr>
+        <w:ind w:left="1416"/>
+        <w:rPr>
+          <w:i/>
+          <w:iCs/>
+        </w:rPr>
+      </w:pPr>
+      <w:proofErr w:type="spellStart"/>
+      <w:r>
+        <w:rPr>
+          <w:i/>
+          <w:iCs/>
+        </w:rPr>
+        <w:t>sudo</w:t>
+      </w:r>
+      <w:proofErr w:type="spellEnd"/>
+      <w:r>
+        <w:rPr>
+          <w:i/>
+          <w:iCs/>
+        </w:rPr>
+        <w:t xml:space="preserve"> </w:t>
+      </w:r>
+      <w:proofErr w:type="spellStart"/>
+      <w:r>
+        <w:rPr>
+          <w:i/>
+          <w:iCs/>
+        </w:rPr>
+        <w:t>install</w:t>
+      </w:r>
+      <w:proofErr w:type="spellEnd"/>
+      <w:r>
+        <w:rPr>
+          <w:i/>
+          <w:iCs/>
+        </w:rPr>
+        <w:t xml:space="preserve"> -d -o multimidia -g multimidia -m 770 /</w:t>
+      </w:r>
+      <w:proofErr w:type="spellStart"/>
+      <w:r>
+        <w:rPr>
+          <w:i/>
+          <w:iCs/>
+        </w:rPr>
+        <w:t>srv</w:t>
+      </w:r>
+      <w:proofErr w:type="spellEnd"/>
+      <w:r>
+        <w:rPr>
+          <w:i/>
+          <w:iCs/>
+        </w:rPr>
+        <w:t>/</w:t>
+      </w:r>
+      <w:proofErr w:type="spellStart"/>
+      <w:r>
+        <w:rPr>
+          <w:i/>
+          <w:iCs/>
+        </w:rPr>
+        <w:t>minhacnhonline</w:t>
+      </w:r>
+      <w:proofErr w:type="spellEnd"/>
+      <w:r>
+        <w:rPr>
+          <w:i/>
+          <w:iCs/>
+        </w:rPr>
+        <w:t>/</w:t>
+      </w:r>
+      <w:proofErr w:type="spellStart"/>
+      <w:r>
+        <w:rPr>
+          <w:i/>
+          <w:iCs/>
+        </w:rPr>
+        <w:t>run</w:t>
+      </w:r>
+      <w:proofErr w:type="spellEnd"/>
+    </w:p>
+    <w:p>
+      <w:pPr>
+        <w:ind w:left="1416"/>
+        <w:rPr>
+          <w:i/>
+          <w:iCs/>
+        </w:rPr>
+      </w:pPr>
+      <w:r>
+        <w:rPr>
+          <w:i/>
+          <w:iCs/>
+        </w:rPr>
+        <w:t xml:space="preserve">id </w:t>
+      </w:r>
+      <w:proofErr w:type="spellStart"/>
+      <w:r>
+        <w:rPr>
+          <w:i/>
+          <w:iCs/>
+        </w:rPr>
+        <w:t>www</w:t>
+      </w:r>
+      <w:proofErr w:type="spellEnd"/>
+      <w:r>
+        <w:rPr>
+          <w:i/>
+          <w:iCs/>
+        </w:rPr>
+        <w:t xml:space="preserve">-data | </w:t>
+      </w:r>
+      <w:proofErr w:type="spellStart"/>
+      <w:r>
+        <w:rPr>
+          <w:i/>
+          <w:iCs/>
+        </w:rPr>
+        <w:t>grep</w:t>
+      </w:r>
+      <w:proofErr w:type="spellEnd"/>
+      <w:r>
+        <w:rPr>
+          <w:i/>
+          <w:iCs/>
+        </w:rPr>
+        <w:t xml:space="preserve"> -q multimidia || </w:t>
+      </w:r>
+      <w:proofErr w:type="gramStart"/>
+      <w:r>
+        <w:rPr>
+          <w:i/>
+          <w:iCs/>
+        </w:rPr>
+        <w:t xml:space="preserve">{ </w:t>
+      </w:r>
+      <w:proofErr w:type="spellStart"/>
+      <w:r>
+        <w:rPr>
+          <w:i/>
+          <w:iCs/>
+        </w:rPr>
+        <w:t>sudo</w:t>
+      </w:r>
+      <w:proofErr w:type="spellEnd"/>
+      <w:proofErr w:type="gramEnd"/>
+      <w:r>
+        <w:rPr>
+          <w:i/>
+          <w:iCs/>
+        </w:rPr>
+        <w:t xml:space="preserve"> </w:t>
+      </w:r>
+      <w:proofErr w:type="spellStart"/>
+      <w:r>
+        <w:rPr>
+          <w:i/>
+          <w:iCs/>
+        </w:rPr>
+        <w:t>usermod</w:t>
+      </w:r>
+      <w:proofErr w:type="spellEnd"/>
+      <w:r>
+        <w:rPr>
+          <w:i/>
+          <w:iCs/>
+        </w:rPr>
+        <w:t xml:space="preserve"> -</w:t>
+      </w:r>
+      <w:proofErr w:type="spellStart"/>
+      <w:r>
+        <w:rPr>
+          <w:i/>
+          <w:iCs/>
+        </w:rPr>
+        <w:t>aG</w:t>
+      </w:r>
+      <w:proofErr w:type="spellEnd"/>
+      <w:r>
+        <w:rPr>
+          <w:i/>
+          <w:iCs/>
+        </w:rPr>
+        <w:t xml:space="preserve"> multimidia </w:t>
+      </w:r>
+      <w:proofErr w:type="spellStart"/>
+      <w:r>
+        <w:rPr>
+          <w:i/>
+          <w:iCs/>
+        </w:rPr>
+        <w:t>www</w:t>
+      </w:r>
+      <w:proofErr w:type="spellEnd"/>
+      <w:r>
+        <w:rPr>
+          <w:i/>
+          <w:iCs/>
+        </w:rPr>
+        <w:t xml:space="preserve">-data; </w:t>
+      </w:r>
+      <w:proofErr w:type="spellStart"/>
+      <w:r>
+        <w:rPr>
+          <w:i/>
+          <w:iCs/>
+        </w:rPr>
+        <w:t>sudo</w:t>
+      </w:r>
+      <w:proofErr w:type="spellEnd"/>
+      <w:r>
+        <w:rPr>
+          <w:i/>
+          <w:iCs/>
+        </w:rPr>
+        <w:t xml:space="preserve"> </w:t>
+      </w:r>
+      <w:proofErr w:type="spellStart"/>
+      <w:r>
+        <w:rPr>
+          <w:i/>
+          <w:iCs/>
+        </w:rPr>
+        <w:t>systemctl</w:t>
+      </w:r>
+      <w:proofErr w:type="spellEnd"/>
+      <w:r>
+        <w:rPr>
+          <w:i/>
+          <w:iCs/>
+        </w:rPr>
+        <w:t xml:space="preserve"> </w:t>
+      </w:r>
+      <w:proofErr w:type="spellStart"/>
+      <w:r>
+        <w:rPr>
+          <w:i/>
+          <w:iCs/>
+        </w:rPr>
+        <w:t>restart</w:t>
+      </w:r>
+      <w:proofErr w:type="spellEnd"/>
+      <w:r>
+        <w:rPr>
+          <w:i/>
+          <w:iCs/>
+        </w:rPr>
+        <w:t xml:space="preserve"> </w:t>
+      </w:r>
+      <w:proofErr w:type="spellStart"/>
+      <w:r>
+        <w:rPr>
+          <w:i/>
+          <w:iCs/>
+        </w:rPr>
+        <w:t>nginx</w:t>
+      </w:r>
+      <w:proofErr w:type="spellEnd"/>
+      <w:proofErr w:type="gramStart"/>
+      <w:r>
+        <w:rPr>
+          <w:i/>
+          <w:iCs/>
+        </w:rPr>
+        <w:t>; }</w:t>
+      </w:r>
+      <w:proofErr w:type="gramEnd"/>
+    </w:p>
+    <w:p>
+      <w:pPr>
+        <w:rPr>
+          <w:i/>
+          <w:iCs/>
+        </w:rPr>
+      </w:pPr>
+    </w:p>
+    <w:p>
+      <w:pPr>
+        <w:tabs>
+          <w:tab w:val="left" w:pos="977"/>
+        </w:tabs>
+        <w:rPr>
+          <w:b/>
+          <w:bCs/>
+        </w:rPr>
+      </w:pPr>
+      <w:r>
+        <w:rPr>
+          <w:b/>
+          <w:bCs/>
+        </w:rPr>
+        <w:t xml:space="preserve">4) </w:t>
+      </w:r>
+      <w:r>
+        <w:rPr>
+          <w:b/>
+          <w:bCs/>
+        </w:rPr>
+        <w:t xml:space="preserve">Aplique o </w:t>
+      </w:r>
+      <w:proofErr w:type="spellStart"/>
+      <w:r>
+        <w:rPr>
+          <w:b/>
+          <w:bCs/>
+        </w:rPr>
+        <w:t>unit</w:t>
+      </w:r>
+      <w:proofErr w:type="spellEnd"/>
+      <w:r>
+        <w:rPr>
+          <w:b/>
+          <w:bCs/>
+        </w:rPr>
+        <w:t>:</w:t>
+      </w:r>
+    </w:p>
+    <w:p>
+      <w:pPr>
+        <w:tabs>
+          <w:tab w:val="left" w:pos="977"/>
+        </w:tabs>
+        <w:rPr>
+          <w:i/>
+          <w:iCs/>
+        </w:rPr>
+      </w:pPr>
+      <w:r>
+        <w:tab/>
+      </w:r>
+      <w:proofErr w:type="spellStart"/>
+      <w:r>
+        <w:rPr>
+          <w:i/>
+          <w:iCs/>
+        </w:rPr>
+        <w:t>sudo</w:t>
+      </w:r>
+      <w:proofErr w:type="spellEnd"/>
+      <w:r>
+        <w:rPr>
+          <w:i/>
+          <w:iCs/>
+        </w:rPr>
+        <w:t xml:space="preserve"> </w:t>
+      </w:r>
+      <w:proofErr w:type="spellStart"/>
+      <w:r>
+        <w:rPr>
+          <w:i/>
+          <w:iCs/>
+        </w:rPr>
+        <w:t>systemctl</w:t>
+      </w:r>
+      <w:proofErr w:type="spellEnd"/>
+      <w:r>
+        <w:rPr>
+          <w:i/>
+          <w:iCs/>
+        </w:rPr>
+        <w:t xml:space="preserve"> </w:t>
+      </w:r>
+      <w:proofErr w:type="spellStart"/>
+      <w:r>
+        <w:rPr>
+          <w:i/>
+          <w:iCs/>
+        </w:rPr>
+        <w:t>daemon-reload</w:t>
+      </w:r>
+      <w:proofErr w:type="spellEnd"/>
+    </w:p>
+    <w:p>
+      <w:pPr>
+        <w:tabs>
+          <w:tab w:val="left" w:pos="977"/>
+        </w:tabs>
+        <w:rPr>
+          <w:b/>
+          <w:bCs/>
+        </w:rPr>
+      </w:pPr>
+      <w:r>
+        <w:rPr>
+          <w:b/>
+          <w:bCs/>
+        </w:rPr>
+        <w:t xml:space="preserve">4) </w:t>
+      </w:r>
+      <w:r>
+        <w:rPr>
+          <w:b/>
+          <w:bCs/>
+        </w:rPr>
+        <w:t>Inicie o serviço</w:t>
+      </w:r>
+      <w:r>
+        <w:rPr>
+          <w:b/>
+          <w:bCs/>
+        </w:rPr>
+        <w:t>:</w:t>
+      </w:r>
+    </w:p>
+    <w:p>
+      <w:pPr>
+        <w:tabs>
+          <w:tab w:val="left" w:pos="977"/>
+        </w:tabs>
+        <w:rPr>
+          <w:i/>
+          <w:iCs/>
+        </w:rPr>
+      </w:pPr>
+      <w:r>
+        <w:tab/>
+      </w:r>
+      <w:proofErr w:type="spellStart"/>
+      <w:r>
+        <w:rPr>
+          <w:i/>
+          <w:iCs/>
+        </w:rPr>
+        <w:t>sudo</w:t>
+      </w:r>
+      <w:proofErr w:type="spellEnd"/>
+      <w:r>
+        <w:rPr>
+          <w:i/>
+          <w:iCs/>
+        </w:rPr>
+        <w:t xml:space="preserve"> </w:t>
+      </w:r>
+      <w:proofErr w:type="spellStart"/>
+      <w:r>
+        <w:rPr>
+          <w:i/>
+          <w:iCs/>
+        </w:rPr>
+        <w:t>systemctl</w:t>
+      </w:r>
+      <w:proofErr w:type="spellEnd"/>
+      <w:r>
+        <w:rPr>
+          <w:i/>
+          <w:iCs/>
+        </w:rPr>
+        <w:t xml:space="preserve"> </w:t>
+      </w:r>
+      <w:proofErr w:type="spellStart"/>
+      <w:r>
+        <w:rPr>
+          <w:i/>
+          <w:iCs/>
+        </w:rPr>
+        <w:t>restart</w:t>
+      </w:r>
+      <w:proofErr w:type="spellEnd"/>
+      <w:r>
+        <w:rPr>
+          <w:i/>
+          <w:iCs/>
+        </w:rPr>
+        <w:t xml:space="preserve"> </w:t>
+      </w:r>
+      <w:proofErr w:type="spellStart"/>
+      <w:proofErr w:type="gramStart"/>
+      <w:r>
+        <w:rPr>
+          <w:i/>
+          <w:iCs/>
+        </w:rPr>
+        <w:t>minhacnhonline.service</w:t>
+      </w:r>
+      <w:proofErr w:type="spellEnd"/>
+      <w:proofErr w:type="gramEnd"/>
+    </w:p>
+    <w:p>
+      <w:pPr>
+        <w:tabs>
+          <w:tab w:val="left" w:pos="977"/>
+        </w:tabs>
+        <w:rPr>
+          <w:i/>
+          <w:iCs/>
+        </w:rPr>
+      </w:pPr>
+      <w:r>
+        <w:rPr>
+          <w:i/>
+          <w:iCs/>
+        </w:rPr>
+        <w:tab/>
+      </w:r>
+      <w:proofErr w:type="spellStart"/>
+      <w:r>
+        <w:rPr>
+          <w:i/>
+          <w:iCs/>
+        </w:rPr>
+        <w:t>sudo</w:t>
+      </w:r>
+      <w:proofErr w:type="spellEnd"/>
+      <w:r>
+        <w:rPr>
+          <w:i/>
+          <w:iCs/>
+        </w:rPr>
+        <w:t xml:space="preserve"> </w:t>
+      </w:r>
+      <w:proofErr w:type="spellStart"/>
+      <w:r>
+        <w:rPr>
+          <w:i/>
+          <w:iCs/>
+        </w:rPr>
+        <w:t>systemctl</w:t>
+      </w:r>
+      <w:proofErr w:type="spellEnd"/>
+      <w:r>
+        <w:rPr>
+          <w:i/>
+          <w:iCs/>
+        </w:rPr>
+        <w:t xml:space="preserve"> status </w:t>
+      </w:r>
+      <w:proofErr w:type="spellStart"/>
+      <w:proofErr w:type="gramStart"/>
+      <w:r>
+        <w:rPr>
+          <w:i/>
+          <w:iCs/>
+        </w:rPr>
+        <w:t>minhacnhonline.service</w:t>
+      </w:r>
+      <w:proofErr w:type="spellEnd"/>
+      <w:proofErr w:type="gramEnd"/>
+      <w:r>
+        <w:rPr>
+          <w:i/>
+          <w:iCs/>
+        </w:rPr>
+        <w:t xml:space="preserve"> --no-pager</w:t>
+      </w:r>
+    </w:p>
+    <w:p>
+      <w:pPr>
+        <w:tabs>
+          <w:tab w:val="left" w:pos="977"/>
+        </w:tabs>
+        <w:rPr>
+          <w:b/>
+          <w:bCs/>
+          <w:i/>
+          <w:iCs/>
+          <w:color w:val="EE0000"/>
+        </w:rPr>
+      </w:pPr>
+      <w:r>
+        <w:rPr>
+          <w:b/>
+          <w:bCs/>
+          <w:i/>
+          <w:iCs/>
+          <w:color w:val="EE0000"/>
+        </w:rPr>
+        <w:t xml:space="preserve">Se aparecer </w:t>
+      </w:r>
+      <w:proofErr w:type="spellStart"/>
+      <w:r>
+        <w:rPr>
+          <w:b/>
+          <w:bCs/>
+          <w:i/>
+          <w:iCs/>
+          <w:color w:val="538135" w:themeColor="accent6" w:themeShade="BF"/>
+        </w:rPr>
+        <w:t>active</w:t>
+      </w:r>
+      <w:proofErr w:type="spellEnd"/>
+      <w:r>
+        <w:rPr>
+          <w:b/>
+          <w:bCs/>
+          <w:i/>
+          <w:iCs/>
+          <w:color w:val="538135" w:themeColor="accent6" w:themeShade="BF"/>
+        </w:rPr>
+        <w:t xml:space="preserve"> (running)</w:t>
+      </w:r>
+      <w:r>
+        <w:rPr>
+          <w:b/>
+          <w:bCs/>
+          <w:i/>
+          <w:iCs/>
+          <w:color w:val="EE0000"/>
+        </w:rPr>
+        <w:t>, perfeito.</w:t>
+      </w:r>
+    </w:p>
+    <w:p>
+      <w:pPr>
+        <w:rPr>
+          <w:b/>
+          <w:bCs/>
+          <w:i/>
+          <w:iCs/>
+          <w:color w:val="C00000"/>
+        </w:rPr>
+      </w:pPr>
+      <w:r>
+        <w:rPr>
+          <w:b/>
+          <w:bCs/>
+          <w:i/>
+          <w:iCs/>
+          <w:color w:val="C00000"/>
+        </w:rPr>
+        <w:t>1</w:t>
+      </w:r>
+      <w:r>
+        <w:rPr>
+          <w:b/>
+          <w:bCs/>
+          <w:i/>
+          <w:iCs/>
+          <w:color w:val="C00000"/>
+        </w:rPr>
+        <w:t>7</w:t>
+      </w:r>
+      <w:r>
+        <w:rPr>
+          <w:b/>
+          <w:bCs/>
+          <w:i/>
+          <w:iCs/>
+          <w:color w:val="C00000"/>
+        </w:rPr>
+        <w:t xml:space="preserve">. </w:t>
+      </w:r>
+      <w:r>
+        <w:rPr>
+          <w:b/>
+          <w:bCs/>
+          <w:i/>
+          <w:iCs/>
+          <w:color w:val="C00000"/>
+        </w:rPr>
+        <w:t xml:space="preserve">Faltou instalar o </w:t>
+      </w:r>
+      <w:proofErr w:type="spellStart"/>
+      <w:r>
+        <w:rPr>
+          <w:b/>
+          <w:bCs/>
+          <w:i/>
+          <w:iCs/>
+          <w:color w:val="C00000"/>
+        </w:rPr>
+        <w:t>Let's</w:t>
+      </w:r>
+      <w:proofErr w:type="spellEnd"/>
+      <w:r>
+        <w:rPr>
+          <w:b/>
+          <w:bCs/>
+          <w:i/>
+          <w:iCs/>
+          <w:color w:val="C00000"/>
+        </w:rPr>
+        <w:t xml:space="preserve"> </w:t>
+      </w:r>
+      <w:proofErr w:type="spellStart"/>
+      <w:r>
+        <w:rPr>
+          <w:b/>
+          <w:bCs/>
+          <w:i/>
+          <w:iCs/>
+          <w:color w:val="C00000"/>
+        </w:rPr>
+        <w:t>Encrypt</w:t>
+      </w:r>
+      <w:proofErr w:type="spellEnd"/>
+      <w:r>
+        <w:rPr>
+          <w:b/>
+          <w:bCs/>
+          <w:i/>
+          <w:iCs/>
+          <w:color w:val="C00000"/>
+        </w:rPr>
+        <w:t xml:space="preserve"> (certificado público)</w:t>
+      </w:r>
+      <w:r>
+        <w:rPr>
+          <w:b/>
+          <w:bCs/>
+          <w:i/>
+          <w:iCs/>
+          <w:color w:val="C00000"/>
+        </w:rPr>
+        <w:t>:</w:t>
+      </w:r>
+    </w:p>
+    <w:p>
+      <w:pPr>
+        <w:rPr>
+          <w:i/>
+          <w:iCs/>
+        </w:rPr>
+      </w:pPr>
+      <w:r>
+        <w:rPr>
+          <w:i/>
+          <w:iCs/>
+        </w:rPr>
+        <w:t xml:space="preserve">ATENÇÃO: </w:t>
+      </w:r>
+      <w:r>
+        <w:rPr>
+          <w:i/>
+          <w:iCs/>
+        </w:rPr>
+        <w:t xml:space="preserve">desativar o proxy da </w:t>
+      </w:r>
+      <w:proofErr w:type="spellStart"/>
+      <w:r>
+        <w:rPr>
+          <w:i/>
+          <w:iCs/>
+        </w:rPr>
+        <w:t>Cloudflare</w:t>
+      </w:r>
+      <w:proofErr w:type="spellEnd"/>
+      <w:r>
+        <w:rPr>
+          <w:i/>
+          <w:iCs/>
+        </w:rPr>
+        <w:t xml:space="preserve"> (nuvem cinza) por alguns minutos para o desafio HTTP-01 funcionar.</w:t>
+      </w:r>
+    </w:p>
+    <w:p>
+      <w:pPr>
+        <w:rPr>
+          <w:b/>
+          <w:bCs/>
+          <w:i/>
+          <w:iCs/>
+          <w:color w:val="EE0000"/>
+        </w:rPr>
+      </w:pPr>
+    </w:p>
+    <w:p>
+      <w:pPr>
+        <w:tabs>
+          <w:tab w:val="left" w:pos="977"/>
+        </w:tabs>
+        <w:rPr>
+          <w:b/>
+          <w:bCs/>
+        </w:rPr>
+      </w:pPr>
+      <w:r>
+        <w:rPr>
+          <w:b/>
+          <w:bCs/>
+        </w:rPr>
+        <w:t xml:space="preserve">4) </w:t>
+      </w:r>
+      <w:r>
+        <w:rPr>
+          <w:b/>
+          <w:bCs/>
+        </w:rPr>
+        <w:t>Teste e recarregue:</w:t>
+      </w:r>
+    </w:p>
+    <w:p>
+      <w:pPr>
+        <w:tabs>
+          <w:tab w:val="left" w:pos="977"/>
+        </w:tabs>
+        <w:rPr>
+          <w:i/>
+          <w:iCs/>
+        </w:rPr>
+      </w:pPr>
+      <w:r>
+        <w:tab/>
+      </w:r>
+      <w:proofErr w:type="spellStart"/>
+      <w:r>
+        <w:rPr>
+          <w:i/>
+          <w:iCs/>
+        </w:rPr>
+        <w:t>sudo</w:t>
+      </w:r>
+      <w:proofErr w:type="spellEnd"/>
+      <w:r>
+        <w:rPr>
+          <w:i/>
+          <w:iCs/>
+        </w:rPr>
+        <w:t xml:space="preserve"> </w:t>
+      </w:r>
+      <w:proofErr w:type="spellStart"/>
+      <w:r>
+        <w:rPr>
+          <w:i/>
+          <w:iCs/>
+        </w:rPr>
+        <w:t>nginx</w:t>
+      </w:r>
+      <w:proofErr w:type="spellEnd"/>
+      <w:r>
+        <w:rPr>
+          <w:i/>
+          <w:iCs/>
+        </w:rPr>
+        <w:t xml:space="preserve"> -t &amp;&amp; </w:t>
+      </w:r>
+      <w:proofErr w:type="spellStart"/>
+      <w:r>
+        <w:rPr>
+          <w:i/>
+          <w:iCs/>
+        </w:rPr>
+        <w:t>sudo</w:t>
+      </w:r>
+      <w:proofErr w:type="spellEnd"/>
+      <w:r>
+        <w:rPr>
+          <w:i/>
+          <w:iCs/>
+        </w:rPr>
+        <w:t xml:space="preserve"> </w:t>
+      </w:r>
+      <w:proofErr w:type="spellStart"/>
+      <w:r>
+        <w:rPr>
+          <w:i/>
+          <w:iCs/>
+        </w:rPr>
+        <w:t>systemctl</w:t>
+      </w:r>
+      <w:proofErr w:type="spellEnd"/>
+      <w:r>
+        <w:rPr>
+          <w:i/>
+          <w:iCs/>
+        </w:rPr>
+        <w:t xml:space="preserve"> </w:t>
+      </w:r>
+      <w:proofErr w:type="spellStart"/>
+      <w:r>
+        <w:rPr>
+          <w:i/>
+          <w:iCs/>
+        </w:rPr>
+        <w:t>reload</w:t>
+      </w:r>
+      <w:proofErr w:type="spellEnd"/>
+      <w:r>
+        <w:rPr>
+          <w:i/>
+          <w:iCs/>
+        </w:rPr>
+        <w:t xml:space="preserve"> </w:t>
+      </w:r>
+      <w:proofErr w:type="spellStart"/>
+      <w:r>
+        <w:rPr>
+          <w:i/>
+          <w:iCs/>
+        </w:rPr>
+        <w:t>nginx</w:t>
+      </w:r>
+      <w:proofErr w:type="spellEnd"/>
     </w:p>
     <w:sectPr>
       <w:pgSz w:w="11906" w:h="16838"/>
@@ -20510,6 +23911,155 @@
     </w:lvl>
   </w:abstractNum>
   <w:abstractNum w:abstractNumId="6" w15:restartNumberingAfterBreak="0">
+    <w:nsid w:val="3FCA6CD7"/>
+    <w:multiLevelType w:val="multilevel"/>
+    <w:tmpl w:val="9F38A842"/>
+    <w:lvl w:ilvl="0">
+      <w:start w:val="1"/>
+      <w:numFmt w:val="bullet"/>
+      <w:lvlText w:val=""/>
+      <w:lvlJc w:val="left"/>
+      <w:pPr>
+        <w:tabs>
+          <w:tab w:val="num" w:pos="720"/>
+        </w:tabs>
+        <w:ind w:left="720" w:hanging="360"/>
+      </w:pPr>
+      <w:rPr>
+        <w:rFonts w:ascii="Symbol" w:hAnsi="Symbol" w:hint="default"/>
+        <w:sz w:val="20"/>
+      </w:rPr>
+    </w:lvl>
+    <w:lvl w:ilvl="1" w:tentative="1">
+      <w:start w:val="1"/>
+      <w:numFmt w:val="bullet"/>
+      <w:lvlText w:val="o"/>
+      <w:lvlJc w:val="left"/>
+      <w:pPr>
+        <w:tabs>
+          <w:tab w:val="num" w:pos="1440"/>
+        </w:tabs>
+        <w:ind w:left="1440" w:hanging="360"/>
+      </w:pPr>
+      <w:rPr>
+        <w:rFonts w:ascii="Courier New" w:hAnsi="Courier New" w:hint="default"/>
+        <w:sz w:val="20"/>
+      </w:rPr>
+    </w:lvl>
+    <w:lvl w:ilvl="2" w:tentative="1">
+      <w:start w:val="1"/>
+      <w:numFmt w:val="bullet"/>
+      <w:lvlText w:val=""/>
+      <w:lvlJc w:val="left"/>
+      <w:pPr>
+        <w:tabs>
+          <w:tab w:val="num" w:pos="2160"/>
+        </w:tabs>
+        <w:ind w:left="2160" w:hanging="360"/>
+      </w:pPr>
+      <w:rPr>
+        <w:rFonts w:ascii="Wingdings" w:hAnsi="Wingdings" w:hint="default"/>
+        <w:sz w:val="20"/>
+      </w:rPr>
+    </w:lvl>
+    <w:lvl w:ilvl="3" w:tentative="1">
+      <w:start w:val="1"/>
+      <w:numFmt w:val="bullet"/>
+      <w:lvlText w:val=""/>
+      <w:lvlJc w:val="left"/>
+      <w:pPr>
+        <w:tabs>
+          <w:tab w:val="num" w:pos="2880"/>
+        </w:tabs>
+        <w:ind w:left="2880" w:hanging="360"/>
+      </w:pPr>
+      <w:rPr>
+        <w:rFonts w:ascii="Wingdings" w:hAnsi="Wingdings" w:hint="default"/>
+        <w:sz w:val="20"/>
+      </w:rPr>
+    </w:lvl>
+    <w:lvl w:ilvl="4" w:tentative="1">
+      <w:start w:val="1"/>
+      <w:numFmt w:val="bullet"/>
+      <w:lvlText w:val=""/>
+      <w:lvlJc w:val="left"/>
+      <w:pPr>
+        <w:tabs>
+          <w:tab w:val="num" w:pos="3600"/>
+        </w:tabs>
+        <w:ind w:left="3600" w:hanging="360"/>
+      </w:pPr>
+      <w:rPr>
+        <w:rFonts w:ascii="Wingdings" w:hAnsi="Wingdings" w:hint="default"/>
+        <w:sz w:val="20"/>
+      </w:rPr>
+    </w:lvl>
+    <w:lvl w:ilvl="5" w:tentative="1">
+      <w:start w:val="1"/>
+      <w:numFmt w:val="bullet"/>
+      <w:lvlText w:val=""/>
+      <w:lvlJc w:val="left"/>
+      <w:pPr>
+        <w:tabs>
+          <w:tab w:val="num" w:pos="4320"/>
+        </w:tabs>
+        <w:ind w:left="4320" w:hanging="360"/>
+      </w:pPr>
+      <w:rPr>
+        <w:rFonts w:ascii="Wingdings" w:hAnsi="Wingdings" w:hint="default"/>
+        <w:sz w:val="20"/>
+      </w:rPr>
+    </w:lvl>
+    <w:lvl w:ilvl="6" w:tentative="1">
+      <w:start w:val="1"/>
+      <w:numFmt w:val="bullet"/>
+      <w:lvlText w:val=""/>
+      <w:lvlJc w:val="left"/>
+      <w:pPr>
+        <w:tabs>
+          <w:tab w:val="num" w:pos="5040"/>
+        </w:tabs>
+        <w:ind w:left="5040" w:hanging="360"/>
+      </w:pPr>
+      <w:rPr>
+        <w:rFonts w:ascii="Wingdings" w:hAnsi="Wingdings" w:hint="default"/>
+        <w:sz w:val="20"/>
+      </w:rPr>
+    </w:lvl>
+    <w:lvl w:ilvl="7" w:tentative="1">
+      <w:start w:val="1"/>
+      <w:numFmt w:val="bullet"/>
+      <w:lvlText w:val=""/>
+      <w:lvlJc w:val="left"/>
+      <w:pPr>
+        <w:tabs>
+          <w:tab w:val="num" w:pos="5760"/>
+        </w:tabs>
+        <w:ind w:left="5760" w:hanging="360"/>
+      </w:pPr>
+      <w:rPr>
+        <w:rFonts w:ascii="Wingdings" w:hAnsi="Wingdings" w:hint="default"/>
+        <w:sz w:val="20"/>
+      </w:rPr>
+    </w:lvl>
+    <w:lvl w:ilvl="8" w:tentative="1">
+      <w:start w:val="1"/>
+      <w:numFmt w:val="bullet"/>
+      <w:lvlText w:val=""/>
+      <w:lvlJc w:val="left"/>
+      <w:pPr>
+        <w:tabs>
+          <w:tab w:val="num" w:pos="6480"/>
+        </w:tabs>
+        <w:ind w:left="6480" w:hanging="360"/>
+      </w:pPr>
+      <w:rPr>
+        <w:rFonts w:ascii="Wingdings" w:hAnsi="Wingdings" w:hint="default"/>
+        <w:sz w:val="20"/>
+      </w:rPr>
+    </w:lvl>
+  </w:abstractNum>
+  <w:abstractNum w:abstractNumId="7" w15:restartNumberingAfterBreak="0">
     <w:nsid w:val="470F58C3"/>
     <w:multiLevelType w:val="hybridMultilevel"/>
     <w:tmpl w:val="4C6C2B5A"/>
@@ -20598,7 +24148,7 @@
       </w:pPr>
     </w:lvl>
   </w:abstractNum>
-  <w:abstractNum w:abstractNumId="7" w15:restartNumberingAfterBreak="0">
+  <w:abstractNum w:abstractNumId="8" w15:restartNumberingAfterBreak="0">
     <w:nsid w:val="5E801261"/>
     <w:multiLevelType w:val="multilevel"/>
     <w:tmpl w:val="A1DE70F2"/>
@@ -20721,19 +24271,22 @@
     <w:abstractNumId w:val="3"/>
   </w:num>
   <w:num w:numId="4" w16cid:durableId="1070031872">
-    <w:abstractNumId w:val="6"/>
+    <w:abstractNumId w:val="7"/>
   </w:num>
   <w:num w:numId="5" w16cid:durableId="841315300">
     <w:abstractNumId w:val="1"/>
   </w:num>
   <w:num w:numId="6" w16cid:durableId="1098260571">
-    <w:abstractNumId w:val="7"/>
+    <w:abstractNumId w:val="8"/>
   </w:num>
   <w:num w:numId="7" w16cid:durableId="1224373501">
     <w:abstractNumId w:val="2"/>
   </w:num>
   <w:num w:numId="8" w16cid:durableId="940377224">
     <w:abstractNumId w:val="5"/>
+  </w:num>
+  <w:num w:numId="9" w16cid:durableId="1336570997">
+    <w:abstractNumId w:val="6"/>
   </w:num>
 </w:numbering>
 </file>

</xml_diff>